<commit_message>
Tighten referat layout: no near-empty pages
Co-Authored-By: Claude Sonnet 5.5 <noreply@anthropic.com>
Claude-Session: https://claude.ai/code/session_01T3CFgpvwhRKeBEwy46XMTn
</commit_message>
<xml_diff>
--- a/Реферат_Гражданкина.docx
+++ b/Реферат_Гражданкина.docx
@@ -824,7 +824,7 @@
     <w:p>
       <w:pPr>
         <w:pageBreakBefore/>
-        <w:spacing w:line="360" w:lineRule="auto" w:after="280" w:before="0"/>
+        <w:spacing w:line="312" w:lineRule="auto" w:after="280" w:before="0"/>
         <w:jc w:val="center"/>
       </w:pPr>
       <w:r>
@@ -841,7 +841,7 @@
         <w:tabs>
           <w:tab w:pos="9071" w:val="right" w:leader="dot"/>
         </w:tabs>
-        <w:spacing w:line="360" w:lineRule="auto" w:after="0" w:before="0"/>
+        <w:spacing w:line="312" w:lineRule="auto" w:after="0" w:before="0"/>
         <w:jc w:val="both"/>
       </w:pPr>
       <w:r>
@@ -901,7 +901,7 @@
         <w:tabs>
           <w:tab w:pos="9071" w:val="right" w:leader="dot"/>
         </w:tabs>
-        <w:spacing w:line="360" w:lineRule="auto" w:after="0" w:before="0"/>
+        <w:spacing w:line="312" w:lineRule="auto" w:after="0" w:before="0"/>
         <w:jc w:val="both"/>
       </w:pPr>
       <w:r>
@@ -946,7 +946,7 @@
           <w:rFonts w:ascii="Times New Roman" w:hAnsi="Times New Roman"/>
           <w:sz w:val="28"/>
         </w:rPr>
-        <w:t>5</w:t>
+        <w:t>4</w:t>
       </w:r>
       <w:r>
         <w:rPr>
@@ -961,7 +961,7 @@
         <w:tabs>
           <w:tab w:pos="9071" w:val="right" w:leader="dot"/>
         </w:tabs>
-        <w:spacing w:line="360" w:lineRule="auto" w:after="0" w:before="0"/>
+        <w:spacing w:line="312" w:lineRule="auto" w:after="0" w:before="0"/>
         <w:jc w:val="both"/>
       </w:pPr>
       <w:r>
@@ -1006,7 +1006,7 @@
           <w:rFonts w:ascii="Times New Roman" w:hAnsi="Times New Roman"/>
           <w:sz w:val="28"/>
         </w:rPr>
-        <w:t>7</w:t>
+        <w:t>5</w:t>
       </w:r>
       <w:r>
         <w:rPr>
@@ -1021,7 +1021,7 @@
         <w:tabs>
           <w:tab w:pos="9071" w:val="right" w:leader="dot"/>
         </w:tabs>
-        <w:spacing w:line="360" w:lineRule="auto" w:after="0" w:before="0"/>
+        <w:spacing w:line="312" w:lineRule="auto" w:after="0" w:before="0"/>
         <w:jc w:val="both"/>
       </w:pPr>
       <w:r>
@@ -1066,7 +1066,7 @@
           <w:rFonts w:ascii="Times New Roman" w:hAnsi="Times New Roman"/>
           <w:sz w:val="28"/>
         </w:rPr>
-        <w:t>9</w:t>
+        <w:t>6</w:t>
       </w:r>
       <w:r>
         <w:rPr>
@@ -1081,7 +1081,7 @@
         <w:tabs>
           <w:tab w:pos="9071" w:val="right" w:leader="dot"/>
         </w:tabs>
-        <w:spacing w:line="360" w:lineRule="auto" w:after="0" w:before="0"/>
+        <w:spacing w:line="312" w:lineRule="auto" w:after="0" w:before="0"/>
         <w:jc w:val="both"/>
       </w:pPr>
       <w:r>
@@ -1126,7 +1126,7 @@
           <w:rFonts w:ascii="Times New Roman" w:hAnsi="Times New Roman"/>
           <w:sz w:val="28"/>
         </w:rPr>
-        <w:t>11</w:t>
+        <w:t>7</w:t>
       </w:r>
       <w:r>
         <w:rPr>
@@ -1141,7 +1141,7 @@
         <w:tabs>
           <w:tab w:pos="9071" w:val="right" w:leader="dot"/>
         </w:tabs>
-        <w:spacing w:line="360" w:lineRule="auto" w:after="0" w:before="0"/>
+        <w:spacing w:line="312" w:lineRule="auto" w:after="0" w:before="0"/>
         <w:jc w:val="both"/>
       </w:pPr>
       <w:r>
@@ -1186,7 +1186,7 @@
           <w:rFonts w:ascii="Times New Roman" w:hAnsi="Times New Roman"/>
           <w:sz w:val="28"/>
         </w:rPr>
-        <w:t>13</w:t>
+        <w:t>8</w:t>
       </w:r>
       <w:r>
         <w:rPr>
@@ -1201,7 +1201,7 @@
         <w:tabs>
           <w:tab w:pos="9071" w:val="right" w:leader="dot"/>
         </w:tabs>
-        <w:spacing w:line="360" w:lineRule="auto" w:after="0" w:before="0"/>
+        <w:spacing w:line="312" w:lineRule="auto" w:after="0" w:before="0"/>
         <w:jc w:val="both"/>
       </w:pPr>
       <w:r>
@@ -1246,7 +1246,7 @@
           <w:rFonts w:ascii="Times New Roman" w:hAnsi="Times New Roman"/>
           <w:sz w:val="28"/>
         </w:rPr>
-        <w:t>15</w:t>
+        <w:t>9</w:t>
       </w:r>
       <w:r>
         <w:rPr>
@@ -1261,7 +1261,7 @@
         <w:tabs>
           <w:tab w:pos="9071" w:val="right" w:leader="dot"/>
         </w:tabs>
-        <w:spacing w:line="360" w:lineRule="auto" w:after="0" w:before="0"/>
+        <w:spacing w:line="312" w:lineRule="auto" w:after="0" w:before="0"/>
         <w:jc w:val="both"/>
       </w:pPr>
       <w:r>
@@ -1306,7 +1306,7 @@
           <w:rFonts w:ascii="Times New Roman" w:hAnsi="Times New Roman"/>
           <w:sz w:val="28"/>
         </w:rPr>
-        <w:t>17</w:t>
+        <w:t>10</w:t>
       </w:r>
       <w:r>
         <w:rPr>
@@ -1321,7 +1321,7 @@
         <w:tabs>
           <w:tab w:pos="9071" w:val="right" w:leader="dot"/>
         </w:tabs>
-        <w:spacing w:line="360" w:lineRule="auto" w:after="0" w:before="0"/>
+        <w:spacing w:line="312" w:lineRule="auto" w:after="0" w:before="0"/>
         <w:jc w:val="both"/>
       </w:pPr>
       <w:r>
@@ -1366,7 +1366,7 @@
           <w:rFonts w:ascii="Times New Roman" w:hAnsi="Times New Roman"/>
           <w:sz w:val="28"/>
         </w:rPr>
-        <w:t>19</w:t>
+        <w:t>11</w:t>
       </w:r>
       <w:r>
         <w:rPr>
@@ -1381,7 +1381,7 @@
         <w:tabs>
           <w:tab w:pos="9071" w:val="right" w:leader="dot"/>
         </w:tabs>
-        <w:spacing w:line="360" w:lineRule="auto" w:after="0" w:before="0"/>
+        <w:spacing w:line="312" w:lineRule="auto" w:after="0" w:before="0"/>
         <w:jc w:val="both"/>
       </w:pPr>
       <w:r>
@@ -1426,7 +1426,7 @@
           <w:rFonts w:ascii="Times New Roman" w:hAnsi="Times New Roman"/>
           <w:sz w:val="28"/>
         </w:rPr>
-        <w:t>21</w:t>
+        <w:t>12</w:t>
       </w:r>
       <w:r>
         <w:rPr>
@@ -1441,7 +1441,7 @@
         <w:tabs>
           <w:tab w:pos="9071" w:val="right" w:leader="dot"/>
         </w:tabs>
-        <w:spacing w:line="360" w:lineRule="auto" w:after="0" w:before="0"/>
+        <w:spacing w:line="312" w:lineRule="auto" w:after="0" w:before="0"/>
         <w:jc w:val="both"/>
       </w:pPr>
       <w:r>
@@ -1486,7 +1486,7 @@
           <w:rFonts w:ascii="Times New Roman" w:hAnsi="Times New Roman"/>
           <w:sz w:val="28"/>
         </w:rPr>
-        <w:t>23</w:t>
+        <w:t>13</w:t>
       </w:r>
       <w:r>
         <w:rPr>
@@ -1500,7 +1500,7 @@
       <w:pPr>
         <w:keepNext/>
         <w:pageBreakBefore/>
-        <w:spacing w:line="360" w:lineRule="auto" w:after="280" w:before="0"/>
+        <w:spacing w:line="312" w:lineRule="auto" w:after="280" w:before="0"/>
         <w:ind w:firstLine="709"/>
         <w:jc w:val="both"/>
         <w:outlineLvl w:val="0"/>
@@ -1518,7 +1518,7 @@
     </w:p>
     <w:p>
       <w:pPr>
-        <w:spacing w:line="360" w:lineRule="auto" w:after="0" w:before="0"/>
+        <w:spacing w:line="312" w:lineRule="auto" w:after="0" w:before="0"/>
         <w:ind w:firstLine="709"/>
         <w:jc w:val="both"/>
       </w:pPr>
@@ -1533,7 +1533,7 @@
     </w:p>
     <w:p>
       <w:pPr>
-        <w:spacing w:line="360" w:lineRule="auto" w:after="0" w:before="0"/>
+        <w:spacing w:line="312" w:lineRule="auto" w:after="0" w:before="0"/>
         <w:ind w:firstLine="709"/>
         <w:jc w:val="both"/>
       </w:pPr>
@@ -1548,7 +1548,7 @@
     </w:p>
     <w:p>
       <w:pPr>
-        <w:spacing w:line="360" w:lineRule="auto" w:after="0" w:before="0"/>
+        <w:spacing w:line="312" w:lineRule="auto" w:after="0" w:before="0"/>
         <w:ind w:firstLine="709"/>
         <w:jc w:val="both"/>
       </w:pPr>
@@ -1563,7 +1563,7 @@
     </w:p>
     <w:p>
       <w:pPr>
-        <w:spacing w:line="360" w:lineRule="auto" w:after="0" w:before="0"/>
+        <w:spacing w:line="312" w:lineRule="auto" w:after="0" w:before="0"/>
         <w:ind w:firstLine="709"/>
         <w:jc w:val="both"/>
       </w:pPr>
@@ -1578,7 +1578,7 @@
     </w:p>
     <w:p>
       <w:pPr>
-        <w:spacing w:line="360" w:lineRule="auto" w:after="0" w:before="0"/>
+        <w:spacing w:line="312" w:lineRule="auto" w:after="0" w:before="0"/>
         <w:ind w:firstLine="709"/>
         <w:jc w:val="both"/>
       </w:pPr>
@@ -1595,7 +1595,7 @@
       <w:pPr>
         <w:keepNext/>
         <w:pageBreakBefore/>
-        <w:spacing w:line="360" w:lineRule="auto" w:after="280" w:before="0"/>
+        <w:spacing w:line="312" w:lineRule="auto" w:after="280" w:before="0"/>
         <w:ind w:firstLine="709"/>
         <w:jc w:val="both"/>
         <w:outlineLvl w:val="0"/>
@@ -1613,7 +1613,7 @@
     </w:p>
     <w:p>
       <w:pPr>
-        <w:spacing w:line="360" w:lineRule="auto" w:after="0" w:before="0"/>
+        <w:spacing w:line="312" w:lineRule="auto" w:after="0" w:before="0"/>
         <w:ind w:firstLine="709"/>
         <w:jc w:val="both"/>
       </w:pPr>
@@ -1628,7 +1628,7 @@
     </w:p>
     <w:p>
       <w:pPr>
-        <w:spacing w:line="360" w:lineRule="auto" w:after="0" w:before="0"/>
+        <w:spacing w:line="312" w:lineRule="auto" w:after="0" w:before="0"/>
         <w:ind w:firstLine="709"/>
         <w:jc w:val="both"/>
       </w:pPr>
@@ -1643,7 +1643,7 @@
     </w:p>
     <w:p>
       <w:pPr>
-        <w:spacing w:line="360" w:lineRule="auto" w:after="0" w:before="0"/>
+        <w:spacing w:line="312" w:lineRule="auto" w:after="0" w:before="0"/>
         <w:ind w:firstLine="709"/>
         <w:jc w:val="both"/>
       </w:pPr>
@@ -1658,7 +1658,7 @@
     </w:p>
     <w:p>
       <w:pPr>
-        <w:spacing w:line="360" w:lineRule="auto" w:after="0" w:before="0"/>
+        <w:spacing w:line="312" w:lineRule="auto" w:after="0" w:before="0"/>
         <w:ind w:firstLine="709"/>
         <w:jc w:val="both"/>
       </w:pPr>
@@ -1673,7 +1673,7 @@
     </w:p>
     <w:p>
       <w:pPr>
-        <w:spacing w:line="360" w:lineRule="auto" w:after="0" w:before="0"/>
+        <w:spacing w:line="312" w:lineRule="auto" w:after="0" w:before="0"/>
         <w:ind w:firstLine="709"/>
         <w:jc w:val="both"/>
       </w:pPr>
@@ -1690,7 +1690,7 @@
       <w:pPr>
         <w:keepNext/>
         <w:pageBreakBefore/>
-        <w:spacing w:line="360" w:lineRule="auto" w:after="280" w:before="0"/>
+        <w:spacing w:line="312" w:lineRule="auto" w:after="280" w:before="0"/>
         <w:ind w:firstLine="709"/>
         <w:jc w:val="both"/>
         <w:outlineLvl w:val="0"/>
@@ -1708,7 +1708,7 @@
     </w:p>
     <w:p>
       <w:pPr>
-        <w:spacing w:line="360" w:lineRule="auto" w:after="0" w:before="0"/>
+        <w:spacing w:line="312" w:lineRule="auto" w:after="0" w:before="0"/>
         <w:ind w:firstLine="709"/>
         <w:jc w:val="both"/>
       </w:pPr>
@@ -1723,7 +1723,7 @@
     </w:p>
     <w:p>
       <w:pPr>
-        <w:spacing w:line="360" w:lineRule="auto" w:after="0" w:before="0"/>
+        <w:spacing w:line="312" w:lineRule="auto" w:after="0" w:before="0"/>
         <w:ind w:firstLine="709"/>
         <w:jc w:val="both"/>
       </w:pPr>
@@ -1738,7 +1738,7 @@
     </w:p>
     <w:p>
       <w:pPr>
-        <w:spacing w:line="360" w:lineRule="auto" w:after="0" w:before="0"/>
+        <w:spacing w:line="312" w:lineRule="auto" w:after="0" w:before="0"/>
         <w:ind w:firstLine="709"/>
         <w:jc w:val="both"/>
       </w:pPr>
@@ -1753,7 +1753,7 @@
     </w:p>
     <w:p>
       <w:pPr>
-        <w:spacing w:line="360" w:lineRule="auto" w:after="0" w:before="0"/>
+        <w:spacing w:line="312" w:lineRule="auto" w:after="0" w:before="0"/>
         <w:ind w:firstLine="709"/>
         <w:jc w:val="both"/>
       </w:pPr>
@@ -1768,7 +1768,7 @@
     </w:p>
     <w:p>
       <w:pPr>
-        <w:spacing w:line="360" w:lineRule="auto" w:after="0" w:before="0"/>
+        <w:spacing w:line="312" w:lineRule="auto" w:after="0" w:before="0"/>
         <w:ind w:firstLine="709"/>
         <w:jc w:val="both"/>
       </w:pPr>
@@ -1785,7 +1785,7 @@
       <w:pPr>
         <w:keepNext/>
         <w:pageBreakBefore/>
-        <w:spacing w:line="360" w:lineRule="auto" w:after="280" w:before="0"/>
+        <w:spacing w:line="312" w:lineRule="auto" w:after="280" w:before="0"/>
         <w:ind w:firstLine="709"/>
         <w:jc w:val="both"/>
         <w:outlineLvl w:val="0"/>
@@ -1803,7 +1803,7 @@
     </w:p>
     <w:p>
       <w:pPr>
-        <w:spacing w:line="360" w:lineRule="auto" w:after="0" w:before="0"/>
+        <w:spacing w:line="312" w:lineRule="auto" w:after="0" w:before="0"/>
         <w:ind w:firstLine="709"/>
         <w:jc w:val="both"/>
       </w:pPr>
@@ -1818,7 +1818,7 @@
     </w:p>
     <w:p>
       <w:pPr>
-        <w:spacing w:line="360" w:lineRule="auto" w:after="0" w:before="0"/>
+        <w:spacing w:line="312" w:lineRule="auto" w:after="0" w:before="0"/>
         <w:ind w:firstLine="709"/>
         <w:jc w:val="both"/>
       </w:pPr>
@@ -1833,7 +1833,7 @@
     </w:p>
     <w:p>
       <w:pPr>
-        <w:spacing w:line="360" w:lineRule="auto" w:after="0" w:before="0"/>
+        <w:spacing w:line="312" w:lineRule="auto" w:after="0" w:before="0"/>
         <w:ind w:firstLine="709"/>
         <w:jc w:val="both"/>
       </w:pPr>
@@ -1848,7 +1848,7 @@
     </w:p>
     <w:p>
       <w:pPr>
-        <w:spacing w:line="360" w:lineRule="auto" w:after="0" w:before="0"/>
+        <w:spacing w:line="312" w:lineRule="auto" w:after="0" w:before="0"/>
         <w:ind w:firstLine="709"/>
         <w:jc w:val="both"/>
       </w:pPr>
@@ -1863,7 +1863,7 @@
     </w:p>
     <w:p>
       <w:pPr>
-        <w:spacing w:line="360" w:lineRule="auto" w:after="0" w:before="0"/>
+        <w:spacing w:line="312" w:lineRule="auto" w:after="0" w:before="0"/>
         <w:ind w:firstLine="709"/>
         <w:jc w:val="both"/>
       </w:pPr>
@@ -1880,7 +1880,7 @@
       <w:pPr>
         <w:keepNext/>
         <w:pageBreakBefore/>
-        <w:spacing w:line="360" w:lineRule="auto" w:after="280" w:before="0"/>
+        <w:spacing w:line="312" w:lineRule="auto" w:after="280" w:before="0"/>
         <w:ind w:firstLine="709"/>
         <w:jc w:val="both"/>
         <w:outlineLvl w:val="0"/>
@@ -1898,7 +1898,7 @@
     </w:p>
     <w:p>
       <w:pPr>
-        <w:spacing w:line="360" w:lineRule="auto" w:after="0" w:before="0"/>
+        <w:spacing w:line="312" w:lineRule="auto" w:after="0" w:before="0"/>
         <w:ind w:firstLine="709"/>
         <w:jc w:val="both"/>
       </w:pPr>
@@ -1913,7 +1913,7 @@
     </w:p>
     <w:p>
       <w:pPr>
-        <w:spacing w:line="360" w:lineRule="auto" w:after="0" w:before="0"/>
+        <w:spacing w:line="312" w:lineRule="auto" w:after="0" w:before="0"/>
         <w:ind w:firstLine="709"/>
         <w:jc w:val="both"/>
       </w:pPr>
@@ -1928,7 +1928,7 @@
     </w:p>
     <w:p>
       <w:pPr>
-        <w:spacing w:line="360" w:lineRule="auto" w:after="0" w:before="0"/>
+        <w:spacing w:line="312" w:lineRule="auto" w:after="0" w:before="0"/>
         <w:ind w:firstLine="709"/>
         <w:jc w:val="both"/>
       </w:pPr>
@@ -1943,7 +1943,7 @@
     </w:p>
     <w:p>
       <w:pPr>
-        <w:spacing w:line="360" w:lineRule="auto" w:after="0" w:before="0"/>
+        <w:spacing w:line="312" w:lineRule="auto" w:after="0" w:before="0"/>
         <w:ind w:firstLine="709"/>
         <w:jc w:val="both"/>
       </w:pPr>
@@ -1958,7 +1958,7 @@
     </w:p>
     <w:p>
       <w:pPr>
-        <w:spacing w:line="360" w:lineRule="auto" w:after="0" w:before="0"/>
+        <w:spacing w:line="312" w:lineRule="auto" w:after="0" w:before="0"/>
         <w:ind w:firstLine="709"/>
         <w:jc w:val="both"/>
       </w:pPr>
@@ -1975,7 +1975,7 @@
       <w:pPr>
         <w:keepNext/>
         <w:pageBreakBefore/>
-        <w:spacing w:line="360" w:lineRule="auto" w:after="280" w:before="0"/>
+        <w:spacing w:line="312" w:lineRule="auto" w:after="280" w:before="0"/>
         <w:ind w:firstLine="709"/>
         <w:jc w:val="both"/>
         <w:outlineLvl w:val="0"/>
@@ -1993,7 +1993,7 @@
     </w:p>
     <w:p>
       <w:pPr>
-        <w:spacing w:line="360" w:lineRule="auto" w:after="0" w:before="0"/>
+        <w:spacing w:line="312" w:lineRule="auto" w:after="0" w:before="0"/>
         <w:ind w:firstLine="709"/>
         <w:jc w:val="both"/>
       </w:pPr>
@@ -2008,7 +2008,7 @@
     </w:p>
     <w:p>
       <w:pPr>
-        <w:spacing w:line="360" w:lineRule="auto" w:after="0" w:before="0"/>
+        <w:spacing w:line="312" w:lineRule="auto" w:after="0" w:before="0"/>
         <w:ind w:firstLine="709"/>
         <w:jc w:val="both"/>
       </w:pPr>
@@ -2023,7 +2023,7 @@
     </w:p>
     <w:p>
       <w:pPr>
-        <w:spacing w:line="360" w:lineRule="auto" w:after="0" w:before="0"/>
+        <w:spacing w:line="312" w:lineRule="auto" w:after="0" w:before="0"/>
         <w:ind w:firstLine="709"/>
         <w:jc w:val="both"/>
       </w:pPr>
@@ -2038,7 +2038,7 @@
     </w:p>
     <w:p>
       <w:pPr>
-        <w:spacing w:line="360" w:lineRule="auto" w:after="0" w:before="0"/>
+        <w:spacing w:line="312" w:lineRule="auto" w:after="0" w:before="0"/>
         <w:ind w:firstLine="709"/>
         <w:jc w:val="both"/>
       </w:pPr>
@@ -2053,7 +2053,7 @@
     </w:p>
     <w:p>
       <w:pPr>
-        <w:spacing w:line="360" w:lineRule="auto" w:after="0" w:before="0"/>
+        <w:spacing w:line="312" w:lineRule="auto" w:after="0" w:before="0"/>
         <w:ind w:firstLine="709"/>
         <w:jc w:val="both"/>
       </w:pPr>
@@ -2070,7 +2070,7 @@
       <w:pPr>
         <w:keepNext/>
         <w:pageBreakBefore/>
-        <w:spacing w:line="360" w:lineRule="auto" w:after="280" w:before="0"/>
+        <w:spacing w:line="312" w:lineRule="auto" w:after="280" w:before="0"/>
         <w:ind w:firstLine="709"/>
         <w:jc w:val="both"/>
         <w:outlineLvl w:val="0"/>
@@ -2088,7 +2088,7 @@
     </w:p>
     <w:p>
       <w:pPr>
-        <w:spacing w:line="360" w:lineRule="auto" w:after="0" w:before="0"/>
+        <w:spacing w:line="312" w:lineRule="auto" w:after="0" w:before="0"/>
         <w:ind w:firstLine="709"/>
         <w:jc w:val="both"/>
       </w:pPr>
@@ -2103,7 +2103,7 @@
     </w:p>
     <w:p>
       <w:pPr>
-        <w:spacing w:line="360" w:lineRule="auto" w:after="0" w:before="0"/>
+        <w:spacing w:line="312" w:lineRule="auto" w:after="0" w:before="0"/>
         <w:ind w:firstLine="709"/>
         <w:jc w:val="both"/>
       </w:pPr>
@@ -2118,7 +2118,7 @@
     </w:p>
     <w:p>
       <w:pPr>
-        <w:spacing w:line="360" w:lineRule="auto" w:after="0" w:before="0"/>
+        <w:spacing w:line="312" w:lineRule="auto" w:after="0" w:before="0"/>
         <w:ind w:firstLine="709"/>
         <w:jc w:val="both"/>
       </w:pPr>
@@ -2133,7 +2133,7 @@
     </w:p>
     <w:p>
       <w:pPr>
-        <w:spacing w:line="360" w:lineRule="auto" w:after="0" w:before="0"/>
+        <w:spacing w:line="312" w:lineRule="auto" w:after="0" w:before="0"/>
         <w:ind w:firstLine="709"/>
         <w:jc w:val="both"/>
       </w:pPr>
@@ -2148,7 +2148,7 @@
     </w:p>
     <w:p>
       <w:pPr>
-        <w:spacing w:line="360" w:lineRule="auto" w:after="0" w:before="0"/>
+        <w:spacing w:line="312" w:lineRule="auto" w:after="0" w:before="0"/>
         <w:ind w:firstLine="709"/>
         <w:jc w:val="both"/>
       </w:pPr>
@@ -2165,7 +2165,7 @@
       <w:pPr>
         <w:keepNext/>
         <w:pageBreakBefore/>
-        <w:spacing w:line="360" w:lineRule="auto" w:after="280" w:before="0"/>
+        <w:spacing w:line="312" w:lineRule="auto" w:after="280" w:before="0"/>
         <w:ind w:firstLine="709"/>
         <w:jc w:val="both"/>
         <w:outlineLvl w:val="0"/>
@@ -2183,7 +2183,7 @@
     </w:p>
     <w:p>
       <w:pPr>
-        <w:spacing w:line="360" w:lineRule="auto" w:after="0" w:before="0"/>
+        <w:spacing w:line="312" w:lineRule="auto" w:after="0" w:before="0"/>
         <w:ind w:firstLine="709"/>
         <w:jc w:val="both"/>
       </w:pPr>
@@ -2198,7 +2198,7 @@
     </w:p>
     <w:p>
       <w:pPr>
-        <w:spacing w:line="360" w:lineRule="auto" w:after="0" w:before="0"/>
+        <w:spacing w:line="312" w:lineRule="auto" w:after="0" w:before="0"/>
         <w:ind w:firstLine="709"/>
         <w:jc w:val="both"/>
       </w:pPr>
@@ -2213,7 +2213,7 @@
     </w:p>
     <w:p>
       <w:pPr>
-        <w:spacing w:line="360" w:lineRule="auto" w:after="0" w:before="0"/>
+        <w:spacing w:line="312" w:lineRule="auto" w:after="0" w:before="0"/>
         <w:ind w:firstLine="709"/>
         <w:jc w:val="both"/>
       </w:pPr>
@@ -2228,7 +2228,7 @@
     </w:p>
     <w:p>
       <w:pPr>
-        <w:spacing w:line="360" w:lineRule="auto" w:after="0" w:before="0"/>
+        <w:spacing w:line="312" w:lineRule="auto" w:after="0" w:before="0"/>
         <w:ind w:firstLine="709"/>
         <w:jc w:val="both"/>
       </w:pPr>
@@ -2243,7 +2243,7 @@
     </w:p>
     <w:p>
       <w:pPr>
-        <w:spacing w:line="360" w:lineRule="auto" w:after="0" w:before="0"/>
+        <w:spacing w:line="312" w:lineRule="auto" w:after="0" w:before="0"/>
         <w:ind w:firstLine="709"/>
         <w:jc w:val="both"/>
       </w:pPr>
@@ -2260,7 +2260,7 @@
       <w:pPr>
         <w:keepNext/>
         <w:pageBreakBefore/>
-        <w:spacing w:line="360" w:lineRule="auto" w:after="280" w:before="0"/>
+        <w:spacing w:line="312" w:lineRule="auto" w:after="280" w:before="0"/>
         <w:ind w:firstLine="709"/>
         <w:jc w:val="both"/>
         <w:outlineLvl w:val="0"/>
@@ -2278,7 +2278,7 @@
     </w:p>
     <w:p>
       <w:pPr>
-        <w:spacing w:line="360" w:lineRule="auto" w:after="0" w:before="0"/>
+        <w:spacing w:line="312" w:lineRule="auto" w:after="0" w:before="0"/>
         <w:ind w:firstLine="709"/>
         <w:jc w:val="both"/>
       </w:pPr>
@@ -2293,7 +2293,7 @@
     </w:p>
     <w:p>
       <w:pPr>
-        <w:spacing w:line="360" w:lineRule="auto" w:after="0" w:before="0"/>
+        <w:spacing w:line="312" w:lineRule="auto" w:after="0" w:before="0"/>
         <w:ind w:firstLine="709"/>
         <w:jc w:val="both"/>
       </w:pPr>
@@ -2308,7 +2308,7 @@
     </w:p>
     <w:p>
       <w:pPr>
-        <w:spacing w:line="360" w:lineRule="auto" w:after="0" w:before="0"/>
+        <w:spacing w:line="312" w:lineRule="auto" w:after="0" w:before="0"/>
         <w:ind w:firstLine="709"/>
         <w:jc w:val="both"/>
       </w:pPr>
@@ -2323,7 +2323,7 @@
     </w:p>
     <w:p>
       <w:pPr>
-        <w:spacing w:line="360" w:lineRule="auto" w:after="0" w:before="0"/>
+        <w:spacing w:line="312" w:lineRule="auto" w:after="0" w:before="0"/>
         <w:ind w:firstLine="709"/>
         <w:jc w:val="both"/>
       </w:pPr>
@@ -2338,7 +2338,7 @@
     </w:p>
     <w:p>
       <w:pPr>
-        <w:spacing w:line="360" w:lineRule="auto" w:after="0" w:before="0"/>
+        <w:spacing w:line="312" w:lineRule="auto" w:after="0" w:before="0"/>
         <w:ind w:firstLine="709"/>
         <w:jc w:val="both"/>
       </w:pPr>
@@ -2353,7 +2353,7 @@
     </w:p>
     <w:p>
       <w:pPr>
-        <w:spacing w:line="360" w:lineRule="auto" w:after="0" w:before="0"/>
+        <w:spacing w:line="312" w:lineRule="auto" w:after="0" w:before="0"/>
         <w:ind w:firstLine="709"/>
         <w:jc w:val="both"/>
       </w:pPr>
@@ -2370,7 +2370,7 @@
       <w:pPr>
         <w:keepNext/>
         <w:pageBreakBefore/>
-        <w:spacing w:line="360" w:lineRule="auto" w:after="280" w:before="0"/>
+        <w:spacing w:line="312" w:lineRule="auto" w:after="280" w:before="0"/>
         <w:ind w:firstLine="709"/>
         <w:jc w:val="both"/>
         <w:outlineLvl w:val="0"/>
@@ -2388,7 +2388,7 @@
     </w:p>
     <w:p>
       <w:pPr>
-        <w:spacing w:line="360" w:lineRule="auto" w:after="0" w:before="0"/>
+        <w:spacing w:line="312" w:lineRule="auto" w:after="0" w:before="0"/>
         <w:ind w:firstLine="709"/>
         <w:jc w:val="both"/>
       </w:pPr>
@@ -2403,7 +2403,7 @@
     </w:p>
     <w:p>
       <w:pPr>
-        <w:spacing w:line="360" w:lineRule="auto" w:after="0" w:before="0"/>
+        <w:spacing w:line="312" w:lineRule="auto" w:after="0" w:before="0"/>
         <w:ind w:firstLine="709"/>
         <w:jc w:val="both"/>
       </w:pPr>
@@ -2418,7 +2418,7 @@
     </w:p>
     <w:p>
       <w:pPr>
-        <w:spacing w:line="360" w:lineRule="auto" w:after="0" w:before="0"/>
+        <w:spacing w:line="312" w:lineRule="auto" w:after="0" w:before="0"/>
         <w:ind w:firstLine="709"/>
         <w:jc w:val="both"/>
       </w:pPr>
@@ -2433,7 +2433,7 @@
     </w:p>
     <w:p>
       <w:pPr>
-        <w:spacing w:line="360" w:lineRule="auto" w:after="0" w:before="0"/>
+        <w:spacing w:line="312" w:lineRule="auto" w:after="0" w:before="0"/>
         <w:ind w:firstLine="709"/>
         <w:jc w:val="both"/>
       </w:pPr>
@@ -2448,7 +2448,7 @@
     </w:p>
     <w:p>
       <w:pPr>
-        <w:spacing w:line="360" w:lineRule="auto" w:after="0" w:before="0"/>
+        <w:spacing w:line="312" w:lineRule="auto" w:after="0" w:before="0"/>
         <w:ind w:firstLine="709"/>
         <w:jc w:val="both"/>
       </w:pPr>
@@ -2465,7 +2465,7 @@
       <w:pPr>
         <w:keepNext/>
         <w:pageBreakBefore/>
-        <w:spacing w:line="360" w:lineRule="auto" w:after="280" w:before="0"/>
+        <w:spacing w:line="312" w:lineRule="auto" w:after="280" w:before="0"/>
         <w:ind w:firstLine="709"/>
         <w:jc w:val="both"/>
         <w:outlineLvl w:val="0"/>
@@ -2483,225 +2483,225 @@
     </w:p>
     <w:p>
       <w:pPr>
-        <w:spacing w:line="360" w:lineRule="auto" w:after="0" w:before="0"/>
-        <w:ind w:firstLine="709"/>
-        <w:jc w:val="both"/>
-      </w:pPr>
-      <w:r>
-        <w:rPr>
-          <w:rFonts w:ascii="Times New Roman" w:hAnsi="Times New Roman" w:eastAsia="Times New Roman"/>
-          <w:b w:val="0"/>
-          <w:sz w:val="28"/>
+        <w:spacing w:line="240" w:lineRule="auto" w:after="0" w:before="0"/>
+        <w:ind w:firstLine="709"/>
+        <w:jc w:val="both"/>
+      </w:pPr>
+      <w:r>
+        <w:rPr>
+          <w:rFonts w:ascii="Times New Roman" w:hAnsi="Times New Roman" w:eastAsia="Times New Roman"/>
+          <w:b w:val="0"/>
+          <w:sz w:val="26"/>
         </w:rPr>
         <w:t>1. Psychology 2e : textbook / Spielman R. M., Jenkins W. J., Lovett M. D. Houston : OpenStax, 2020. Section 1.2. History of Psychology. URL: https://openstax.org/books/psychology-2e/pages/1-2-history-of-psychology (дата обращения: 11.10.2026).</w:t>
       </w:r>
     </w:p>
     <w:p>
       <w:pPr>
-        <w:spacing w:line="360" w:lineRule="auto" w:after="0" w:before="0"/>
-        <w:ind w:firstLine="709"/>
-        <w:jc w:val="both"/>
-      </w:pPr>
-      <w:r>
-        <w:rPr>
-          <w:rFonts w:ascii="Times New Roman" w:hAnsi="Times New Roman" w:eastAsia="Times New Roman"/>
-          <w:b w:val="0"/>
-          <w:sz w:val="28"/>
+        <w:spacing w:line="240" w:lineRule="auto" w:after="0" w:before="0"/>
+        <w:ind w:firstLine="709"/>
+        <w:jc w:val="both"/>
+      </w:pPr>
+      <w:r>
+        <w:rPr>
+          <w:rFonts w:ascii="Times New Roman" w:hAnsi="Times New Roman" w:eastAsia="Times New Roman"/>
+          <w:b w:val="0"/>
+          <w:sz w:val="26"/>
         </w:rPr>
         <w:t>2. Yoshimura H. Early psychological apparatuses stored in Japan: imported, replicated, and reformed apparatuses before World War II // Japanese Psychological Research. 2016. Vol. 58, suppl. 1. P. 32–45. DOI: 10.1111/jpr.12112.</w:t>
       </w:r>
     </w:p>
     <w:p>
       <w:pPr>
-        <w:spacing w:line="360" w:lineRule="auto" w:after="0" w:before="0"/>
-        <w:ind w:firstLine="709"/>
-        <w:jc w:val="both"/>
-      </w:pPr>
-      <w:r>
-        <w:rPr>
-          <w:rFonts w:ascii="Times New Roman" w:hAnsi="Times New Roman" w:eastAsia="Times New Roman"/>
-          <w:b w:val="0"/>
-          <w:sz w:val="28"/>
+        <w:spacing w:line="240" w:lineRule="auto" w:after="0" w:before="0"/>
+        <w:ind w:firstLine="709"/>
+        <w:jc w:val="both"/>
+      </w:pPr>
+      <w:r>
+        <w:rPr>
+          <w:rFonts w:ascii="Times New Roman" w:hAnsi="Times New Roman" w:eastAsia="Times New Roman"/>
+          <w:b w:val="0"/>
+          <w:sz w:val="26"/>
         </w:rPr>
         <w:t>3. Schoenherr J. R. Prestige technology in the evolution and social organization of early psychological science // Theory &amp; Psychology. 2017. DOI: 10.1177/0959354316677076.</w:t>
       </w:r>
     </w:p>
     <w:p>
       <w:pPr>
-        <w:spacing w:line="360" w:lineRule="auto" w:after="0" w:before="0"/>
-        <w:ind w:firstLine="709"/>
-        <w:jc w:val="both"/>
-      </w:pPr>
-      <w:r>
-        <w:rPr>
-          <w:rFonts w:ascii="Times New Roman" w:hAnsi="Times New Roman" w:eastAsia="Times New Roman"/>
-          <w:b w:val="0"/>
-          <w:sz w:val="28"/>
+        <w:spacing w:line="240" w:lineRule="auto" w:after="0" w:before="0"/>
+        <w:ind w:firstLine="709"/>
+        <w:jc w:val="both"/>
+      </w:pPr>
+      <w:r>
+        <w:rPr>
+          <w:rFonts w:ascii="Times New Roman" w:hAnsi="Times New Roman" w:eastAsia="Times New Roman"/>
+          <w:b w:val="0"/>
+          <w:sz w:val="26"/>
         </w:rPr>
         <w:t>4. Lemke J. R., Kluger G., Krämer G. Hans Berger und 100 Jahre Elektroenzephalogramm // Clinical Epileptology. 2024. Vol. 37. P. 103–111. DOI: 10.1007/s10309-024-00664-x.</w:t>
       </w:r>
     </w:p>
     <w:p>
       <w:pPr>
-        <w:spacing w:line="360" w:lineRule="auto" w:after="0" w:before="0"/>
-        <w:ind w:firstLine="709"/>
-        <w:jc w:val="both"/>
-      </w:pPr>
-      <w:r>
-        <w:rPr>
-          <w:rFonts w:ascii="Times New Roman" w:hAnsi="Times New Roman" w:eastAsia="Times New Roman"/>
-          <w:b w:val="0"/>
-          <w:sz w:val="28"/>
+        <w:spacing w:line="240" w:lineRule="auto" w:after="0" w:before="0"/>
+        <w:ind w:firstLine="709"/>
+        <w:jc w:val="both"/>
+      </w:pPr>
+      <w:r>
+        <w:rPr>
+          <w:rFonts w:ascii="Times New Roman" w:hAnsi="Times New Roman" w:eastAsia="Times New Roman"/>
+          <w:b w:val="0"/>
+          <w:sz w:val="26"/>
         </w:rPr>
         <w:t>5. Peirce J., Gray J. R., Simpson S. [et al.]. PsychoPy2: experiments in behavior made easy // Behavior Research Methods. 2019. Vol. 51. P. 195–203. DOI: 10.3758/s13428-018-01193-y.</w:t>
       </w:r>
     </w:p>
     <w:p>
       <w:pPr>
-        <w:spacing w:line="360" w:lineRule="auto" w:after="0" w:before="0"/>
-        <w:ind w:firstLine="709"/>
-        <w:jc w:val="both"/>
-      </w:pPr>
-      <w:r>
-        <w:rPr>
-          <w:rFonts w:ascii="Times New Roman" w:hAnsi="Times New Roman" w:eastAsia="Times New Roman"/>
-          <w:b w:val="0"/>
-          <w:sz w:val="28"/>
+        <w:spacing w:line="240" w:lineRule="auto" w:after="0" w:before="0"/>
+        <w:ind w:firstLine="709"/>
+        <w:jc w:val="both"/>
+      </w:pPr>
+      <w:r>
+        <w:rPr>
+          <w:rFonts w:ascii="Times New Roman" w:hAnsi="Times New Roman" w:eastAsia="Times New Roman"/>
+          <w:b w:val="0"/>
+          <w:sz w:val="26"/>
         </w:rPr>
         <w:t>6. Bridges D., Pitiot A., MacAskill M. R. [et al.]. The timing mega-study: comparing a range of experiment generators, both lab-based and online // PeerJ. 2020. Vol. 8. Art. e9414. DOI: 10.7717/peerj.9414.</w:t>
       </w:r>
     </w:p>
     <w:p>
       <w:pPr>
-        <w:spacing w:line="360" w:lineRule="auto" w:after="0" w:before="0"/>
-        <w:ind w:firstLine="709"/>
-        <w:jc w:val="both"/>
-      </w:pPr>
-      <w:r>
-        <w:rPr>
-          <w:rFonts w:ascii="Times New Roman" w:hAnsi="Times New Roman" w:eastAsia="Times New Roman"/>
-          <w:b w:val="0"/>
-          <w:sz w:val="28"/>
+        <w:spacing w:line="240" w:lineRule="auto" w:after="0" w:before="0"/>
+        <w:ind w:firstLine="709"/>
+        <w:jc w:val="both"/>
+      </w:pPr>
+      <w:r>
+        <w:rPr>
+          <w:rFonts w:ascii="Times New Roman" w:hAnsi="Times New Roman" w:eastAsia="Times New Roman"/>
+          <w:b w:val="0"/>
+          <w:sz w:val="26"/>
         </w:rPr>
         <w:t>7. Valtakari N. V., Hooge I. T. C., Viktorsson C. [et al.]. Eye tracking in human interaction: possibilities and limitations // Behavior Research Methods. 2021. Vol. 53. P. 1592–1608. DOI: 10.3758/s13428-020-01517-x.</w:t>
       </w:r>
     </w:p>
     <w:p>
       <w:pPr>
-        <w:spacing w:line="360" w:lineRule="auto" w:after="0" w:before="0"/>
-        <w:ind w:firstLine="709"/>
-        <w:jc w:val="both"/>
-      </w:pPr>
-      <w:r>
-        <w:rPr>
-          <w:rFonts w:ascii="Times New Roman" w:hAnsi="Times New Roman" w:eastAsia="Times New Roman"/>
-          <w:b w:val="0"/>
-          <w:sz w:val="28"/>
+        <w:spacing w:line="240" w:lineRule="auto" w:after="0" w:before="0"/>
+        <w:ind w:firstLine="709"/>
+        <w:jc w:val="both"/>
+      </w:pPr>
+      <w:r>
+        <w:rPr>
+          <w:rFonts w:ascii="Times New Roman" w:hAnsi="Times New Roman" w:eastAsia="Times New Roman"/>
+          <w:b w:val="0"/>
+          <w:sz w:val="26"/>
         </w:rPr>
         <w:t>8. Eklund A., Nichols T. E., Knutsson H. Cluster failure: why fMRI inferences for spatial extent have inflated false-positive rates // Proceedings of the National Academy of Sciences. 2016. Vol. 113, no. 28. P. 7900–7905. DOI: 10.1073/pnas.1602413113.</w:t>
       </w:r>
     </w:p>
     <w:p>
       <w:pPr>
-        <w:spacing w:line="360" w:lineRule="auto" w:after="0" w:before="0"/>
-        <w:ind w:firstLine="709"/>
-        <w:jc w:val="both"/>
-      </w:pPr>
-      <w:r>
-        <w:rPr>
-          <w:rFonts w:ascii="Times New Roman" w:hAnsi="Times New Roman" w:eastAsia="Times New Roman"/>
-          <w:b w:val="0"/>
-          <w:sz w:val="28"/>
+        <w:spacing w:line="240" w:lineRule="auto" w:after="0" w:before="0"/>
+        <w:ind w:firstLine="709"/>
+        <w:jc w:val="both"/>
+      </w:pPr>
+      <w:r>
+        <w:rPr>
+          <w:rFonts w:ascii="Times New Roman" w:hAnsi="Times New Roman" w:eastAsia="Times New Roman"/>
+          <w:b w:val="0"/>
+          <w:sz w:val="26"/>
         </w:rPr>
         <w:t>9. Poldrack R. A., Baker C. I., Durnez J. [et al.]. Scanning the horizon: towards transparent and reproducible neuroimaging research // Nature Reviews Neuroscience. 2017. Vol. 18. P. 115–126. DOI: 10.1038/nrn.2016.167.</w:t>
       </w:r>
     </w:p>
     <w:p>
       <w:pPr>
-        <w:spacing w:line="360" w:lineRule="auto" w:after="0" w:before="0"/>
-        <w:ind w:firstLine="709"/>
-        <w:jc w:val="both"/>
-      </w:pPr>
-      <w:r>
-        <w:rPr>
-          <w:rFonts w:ascii="Times New Roman" w:hAnsi="Times New Roman" w:eastAsia="Times New Roman"/>
-          <w:b w:val="0"/>
-          <w:sz w:val="28"/>
+        <w:spacing w:line="240" w:lineRule="auto" w:after="0" w:before="0"/>
+        <w:ind w:firstLine="709"/>
+        <w:jc w:val="both"/>
+      </w:pPr>
+      <w:r>
+        <w:rPr>
+          <w:rFonts w:ascii="Times New Roman" w:hAnsi="Times New Roman" w:eastAsia="Times New Roman"/>
+          <w:b w:val="0"/>
+          <w:sz w:val="26"/>
         </w:rPr>
         <w:t>10. Anwyl-Irvine A. L., Massonnié J., Flitton A. [et al.]. Gorilla in our midst: an online behavioral experiment builder // Behavior Research Methods. 2020. Vol. 52. P. 388–407. DOI: 10.3758/s13428-019-01237-x.</w:t>
       </w:r>
     </w:p>
     <w:p>
       <w:pPr>
-        <w:spacing w:line="360" w:lineRule="auto" w:after="0" w:before="0"/>
-        <w:ind w:firstLine="709"/>
-        <w:jc w:val="both"/>
-      </w:pPr>
-      <w:r>
-        <w:rPr>
-          <w:rFonts w:ascii="Times New Roman" w:hAnsi="Times New Roman" w:eastAsia="Times New Roman"/>
-          <w:b w:val="0"/>
-          <w:sz w:val="28"/>
+        <w:spacing w:line="240" w:lineRule="auto" w:after="0" w:before="0"/>
+        <w:ind w:firstLine="709"/>
+        <w:jc w:val="both"/>
+      </w:pPr>
+      <w:r>
+        <w:rPr>
+          <w:rFonts w:ascii="Times New Roman" w:hAnsi="Times New Roman" w:eastAsia="Times New Roman"/>
+          <w:b w:val="0"/>
+          <w:sz w:val="26"/>
         </w:rPr>
         <w:t>11. de Leeuw J. R., Gilbert R. A., Luchterhandt B. jsPsych: enabling an open-source collaborative ecosystem of behavioral experiments // Journal of Open Source Software. 2023. Vol. 8, no. 85. Art. 5351. DOI: 10.21105/joss.05351.</w:t>
       </w:r>
     </w:p>
     <w:p>
       <w:pPr>
-        <w:spacing w:line="360" w:lineRule="auto" w:after="0" w:before="0"/>
-        <w:ind w:firstLine="709"/>
-        <w:jc w:val="both"/>
-      </w:pPr>
-      <w:r>
-        <w:rPr>
-          <w:rFonts w:ascii="Times New Roman" w:hAnsi="Times New Roman" w:eastAsia="Times New Roman"/>
-          <w:b w:val="0"/>
-          <w:sz w:val="28"/>
+        <w:spacing w:line="240" w:lineRule="auto" w:after="0" w:before="0"/>
+        <w:ind w:firstLine="709"/>
+        <w:jc w:val="both"/>
+      </w:pPr>
+      <w:r>
+        <w:rPr>
+          <w:rFonts w:ascii="Times New Roman" w:hAnsi="Times New Roman" w:eastAsia="Times New Roman"/>
+          <w:b w:val="0"/>
+          <w:sz w:val="26"/>
         </w:rPr>
         <w:t>12. Harari G. M., Gosling S. D. Understanding behaviours in context using mobile sensing // Nature Reviews Psychology. 2023. Vol. 2. P. 767–779. DOI: 10.1038/s44159-023-00235-3.</w:t>
       </w:r>
     </w:p>
     <w:p>
       <w:pPr>
-        <w:spacing w:line="360" w:lineRule="auto" w:after="0" w:before="0"/>
-        <w:ind w:firstLine="709"/>
-        <w:jc w:val="both"/>
-      </w:pPr>
-      <w:r>
-        <w:rPr>
-          <w:rFonts w:ascii="Times New Roman" w:hAnsi="Times New Roman" w:eastAsia="Times New Roman"/>
-          <w:b w:val="0"/>
-          <w:sz w:val="28"/>
+        <w:spacing w:line="240" w:lineRule="auto" w:after="0" w:before="0"/>
+        <w:ind w:firstLine="709"/>
+        <w:jc w:val="both"/>
+      </w:pPr>
+      <w:r>
+        <w:rPr>
+          <w:rFonts w:ascii="Times New Roman" w:hAnsi="Times New Roman" w:eastAsia="Times New Roman"/>
+          <w:b w:val="0"/>
+          <w:sz w:val="26"/>
         </w:rPr>
         <w:t>13. Slater M., Sanchez-Vives M. V. Enhancing our lives with immersive virtual reality // Frontiers in Robotics and AI. 2016. Vol. 3. Art. 74. DOI: 10.3389/frobt.2016.00074.</w:t>
       </w:r>
     </w:p>
     <w:p>
       <w:pPr>
-        <w:spacing w:line="360" w:lineRule="auto" w:after="0" w:before="0"/>
-        <w:ind w:firstLine="709"/>
-        <w:jc w:val="both"/>
-      </w:pPr>
-      <w:r>
-        <w:rPr>
-          <w:rFonts w:ascii="Times New Roman" w:hAnsi="Times New Roman" w:eastAsia="Times New Roman"/>
-          <w:b w:val="0"/>
-          <w:sz w:val="28"/>
+        <w:spacing w:line="240" w:lineRule="auto" w:after="0" w:before="0"/>
+        <w:ind w:firstLine="709"/>
+        <w:jc w:val="both"/>
+      </w:pPr>
+      <w:r>
+        <w:rPr>
+          <w:rFonts w:ascii="Times New Roman" w:hAnsi="Times New Roman" w:eastAsia="Times New Roman"/>
+          <w:b w:val="0"/>
+          <w:sz w:val="26"/>
         </w:rPr>
         <w:t>14. Anderson N. C., Bischof W. F., Kingstone A. Eye tracking in virtual reality // Current Topics in Behavioral Neurosciences. 2023. Vol. 65. P. 73–100. DOI: 10.1007/7854_2022_409.</w:t>
       </w:r>
     </w:p>
     <w:p>
       <w:pPr>
-        <w:spacing w:line="360" w:lineRule="auto" w:after="0" w:before="0"/>
-        <w:ind w:firstLine="709"/>
-        <w:jc w:val="both"/>
-      </w:pPr>
-      <w:r>
-        <w:rPr>
-          <w:rFonts w:ascii="Times New Roman" w:hAnsi="Times New Roman" w:eastAsia="Times New Roman"/>
-          <w:b w:val="0"/>
-          <w:sz w:val="28"/>
+        <w:spacing w:line="240" w:lineRule="auto" w:after="0" w:before="0"/>
+        <w:ind w:firstLine="709"/>
+        <w:jc w:val="both"/>
+      </w:pPr>
+      <w:r>
+        <w:rPr>
+          <w:rFonts w:ascii="Times New Roman" w:hAnsi="Times New Roman" w:eastAsia="Times New Roman"/>
+          <w:b w:val="0"/>
+          <w:sz w:val="26"/>
         </w:rPr>
         <w:t>15. Nosek B. A., Ebersole C. R., DeHaven A. C. [et al.]. The preregistration revolution // Proceedings of the National Academy of Sciences. 2018. Vol. 115, no. 11. P. 2600–2606. DOI: 10.1073/pnas.1708274114.</w:t>
       </w:r>

</xml_diff>

<commit_message>
Trim referat text so each section fits one page; restore original layout
Co-Authored-By: Claude Sonnet 5.5 <noreply@anthropic.com>
Claude-Session: https://claude.ai/code/session_01T3CFgpvwhRKeBEwy46XMTn
</commit_message>
<xml_diff>
--- a/Реферат_Гражданкина.docx
+++ b/Реферат_Гражданкина.docx
@@ -824,7 +824,7 @@
     <w:p>
       <w:pPr>
         <w:pageBreakBefore/>
-        <w:spacing w:line="312" w:lineRule="auto" w:after="280" w:before="0"/>
+        <w:spacing w:line="360" w:lineRule="auto" w:after="280" w:before="0"/>
         <w:jc w:val="center"/>
       </w:pPr>
       <w:r>
@@ -841,7 +841,7 @@
         <w:tabs>
           <w:tab w:pos="9071" w:val="right" w:leader="dot"/>
         </w:tabs>
-        <w:spacing w:line="312" w:lineRule="auto" w:after="0" w:before="0"/>
+        <w:spacing w:line="360" w:lineRule="auto" w:after="0" w:before="0"/>
         <w:jc w:val="both"/>
       </w:pPr>
       <w:r>
@@ -901,7 +901,7 @@
         <w:tabs>
           <w:tab w:pos="9071" w:val="right" w:leader="dot"/>
         </w:tabs>
-        <w:spacing w:line="312" w:lineRule="auto" w:after="0" w:before="0"/>
+        <w:spacing w:line="360" w:lineRule="auto" w:after="0" w:before="0"/>
         <w:jc w:val="both"/>
       </w:pPr>
       <w:r>
@@ -961,7 +961,7 @@
         <w:tabs>
           <w:tab w:pos="9071" w:val="right" w:leader="dot"/>
         </w:tabs>
-        <w:spacing w:line="312" w:lineRule="auto" w:after="0" w:before="0"/>
+        <w:spacing w:line="360" w:lineRule="auto" w:after="0" w:before="0"/>
         <w:jc w:val="both"/>
       </w:pPr>
       <w:r>
@@ -1021,7 +1021,7 @@
         <w:tabs>
           <w:tab w:pos="9071" w:val="right" w:leader="dot"/>
         </w:tabs>
-        <w:spacing w:line="312" w:lineRule="auto" w:after="0" w:before="0"/>
+        <w:spacing w:line="360" w:lineRule="auto" w:after="0" w:before="0"/>
         <w:jc w:val="both"/>
       </w:pPr>
       <w:r>
@@ -1081,7 +1081,7 @@
         <w:tabs>
           <w:tab w:pos="9071" w:val="right" w:leader="dot"/>
         </w:tabs>
-        <w:spacing w:line="312" w:lineRule="auto" w:after="0" w:before="0"/>
+        <w:spacing w:line="360" w:lineRule="auto" w:after="0" w:before="0"/>
         <w:jc w:val="both"/>
       </w:pPr>
       <w:r>
@@ -1141,7 +1141,7 @@
         <w:tabs>
           <w:tab w:pos="9071" w:val="right" w:leader="dot"/>
         </w:tabs>
-        <w:spacing w:line="312" w:lineRule="auto" w:after="0" w:before="0"/>
+        <w:spacing w:line="360" w:lineRule="auto" w:after="0" w:before="0"/>
         <w:jc w:val="both"/>
       </w:pPr>
       <w:r>
@@ -1201,7 +1201,7 @@
         <w:tabs>
           <w:tab w:pos="9071" w:val="right" w:leader="dot"/>
         </w:tabs>
-        <w:spacing w:line="312" w:lineRule="auto" w:after="0" w:before="0"/>
+        <w:spacing w:line="360" w:lineRule="auto" w:after="0" w:before="0"/>
         <w:jc w:val="both"/>
       </w:pPr>
       <w:r>
@@ -1261,7 +1261,7 @@
         <w:tabs>
           <w:tab w:pos="9071" w:val="right" w:leader="dot"/>
         </w:tabs>
-        <w:spacing w:line="312" w:lineRule="auto" w:after="0" w:before="0"/>
+        <w:spacing w:line="360" w:lineRule="auto" w:after="0" w:before="0"/>
         <w:jc w:val="both"/>
       </w:pPr>
       <w:r>
@@ -1321,7 +1321,7 @@
         <w:tabs>
           <w:tab w:pos="9071" w:val="right" w:leader="dot"/>
         </w:tabs>
-        <w:spacing w:line="312" w:lineRule="auto" w:after="0" w:before="0"/>
+        <w:spacing w:line="360" w:lineRule="auto" w:after="0" w:before="0"/>
         <w:jc w:val="both"/>
       </w:pPr>
       <w:r>
@@ -1381,7 +1381,7 @@
         <w:tabs>
           <w:tab w:pos="9071" w:val="right" w:leader="dot"/>
         </w:tabs>
-        <w:spacing w:line="312" w:lineRule="auto" w:after="0" w:before="0"/>
+        <w:spacing w:line="360" w:lineRule="auto" w:after="0" w:before="0"/>
         <w:jc w:val="both"/>
       </w:pPr>
       <w:r>
@@ -1441,7 +1441,7 @@
         <w:tabs>
           <w:tab w:pos="9071" w:val="right" w:leader="dot"/>
         </w:tabs>
-        <w:spacing w:line="312" w:lineRule="auto" w:after="0" w:before="0"/>
+        <w:spacing w:line="360" w:lineRule="auto" w:after="0" w:before="0"/>
         <w:jc w:val="both"/>
       </w:pPr>
       <w:r>
@@ -1500,7 +1500,7 @@
       <w:pPr>
         <w:keepNext/>
         <w:pageBreakBefore/>
-        <w:spacing w:line="312" w:lineRule="auto" w:after="280" w:before="0"/>
+        <w:spacing w:line="360" w:lineRule="auto" w:after="280" w:before="0"/>
         <w:ind w:firstLine="709"/>
         <w:jc w:val="both"/>
         <w:outlineLvl w:val="0"/>
@@ -1518,22 +1518,22 @@
     </w:p>
     <w:p>
       <w:pPr>
-        <w:spacing w:line="312" w:lineRule="auto" w:after="0" w:before="0"/>
-        <w:ind w:firstLine="709"/>
-        <w:jc w:val="both"/>
-      </w:pPr>
-      <w:r>
-        <w:rPr>
-          <w:rFonts w:ascii="Times New Roman" w:hAnsi="Times New Roman" w:eastAsia="Times New Roman"/>
-          <w:b w:val="0"/>
-          <w:sz w:val="28"/>
-        </w:rPr>
-        <w:t>Когда мы представляем работу психолога, чаще всего вспоминаем беседу или анкету. Однако в научной психологии давно используют приборы. Они помогают измерять время реакции, предъявлять изображения в одинаковых условиях, записывать движения глаз и физиологические сигналы. Благодаря этому исследователь может сравнивать результаты, а не полагаться только на впечатление от разговора.</w:t>
-      </w:r>
-    </w:p>
-    <w:p>
-      <w:pPr>
-        <w:spacing w:line="312" w:lineRule="auto" w:after="0" w:before="0"/>
+        <w:spacing w:line="360" w:lineRule="auto" w:after="0" w:before="0"/>
+        <w:ind w:firstLine="709"/>
+        <w:jc w:val="both"/>
+      </w:pPr>
+      <w:r>
+        <w:rPr>
+          <w:rFonts w:ascii="Times New Roman" w:hAnsi="Times New Roman" w:eastAsia="Times New Roman"/>
+          <w:b w:val="0"/>
+          <w:sz w:val="28"/>
+        </w:rPr>
+        <w:t>Когда мы представляем работу психолога, чаще всего вспоминаем беседу или анкету. Однако в научной психологии давно используют приборы. Они помогают измерять время реакции, предъявлять изображения в одинаковых условиях, записывать движения глаз и физиологические сигналы.</w:t>
+      </w:r>
+    </w:p>
+    <w:p>
+      <w:pPr>
+        <w:spacing w:line="360" w:lineRule="auto" w:after="0" w:before="0"/>
         <w:ind w:firstLine="709"/>
         <w:jc w:val="both"/>
       </w:pPr>
@@ -1548,7 +1548,7 @@
     </w:p>
     <w:p>
       <w:pPr>
-        <w:spacing w:line="312" w:lineRule="auto" w:after="0" w:before="0"/>
+        <w:spacing w:line="360" w:lineRule="auto" w:after="0" w:before="0"/>
         <w:ind w:firstLine="709"/>
         <w:jc w:val="both"/>
       </w:pPr>
@@ -1563,7 +1563,7 @@
     </w:p>
     <w:p>
       <w:pPr>
-        <w:spacing w:line="312" w:lineRule="auto" w:after="0" w:before="0"/>
+        <w:spacing w:line="360" w:lineRule="auto" w:after="0" w:before="0"/>
         <w:ind w:firstLine="709"/>
         <w:jc w:val="both"/>
       </w:pPr>
@@ -1578,24 +1578,24 @@
     </w:p>
     <w:p>
       <w:pPr>
-        <w:spacing w:line="312" w:lineRule="auto" w:after="0" w:before="0"/>
-        <w:ind w:firstLine="709"/>
-        <w:jc w:val="both"/>
-      </w:pPr>
-      <w:r>
-        <w:rPr>
-          <w:rFonts w:ascii="Times New Roman" w:hAnsi="Times New Roman" w:eastAsia="Times New Roman"/>
-          <w:b w:val="0"/>
-          <w:sz w:val="28"/>
-        </w:rPr>
-        <w:t>Материал выстроен по основным этапам: лабораторная механика, электронная регистрация, компьютеризация и цифровая среда. Границы между этапами условны: старые способы измерения не исчезали сразу после появления новых. Главная мысль работы состоит в том, что техника делает наблюдение более точным и проверяемым, если исследователь понимает, что именно измеряет его прибор.</w:t>
+        <w:spacing w:line="360" w:lineRule="auto" w:after="0" w:before="0"/>
+        <w:ind w:firstLine="709"/>
+        <w:jc w:val="both"/>
+      </w:pPr>
+      <w:r>
+        <w:rPr>
+          <w:rFonts w:ascii="Times New Roman" w:hAnsi="Times New Roman" w:eastAsia="Times New Roman"/>
+          <w:b w:val="0"/>
+          <w:sz w:val="28"/>
+        </w:rPr>
+        <w:t>Материал выстроен по основным этапам: лабораторная механика, электронная регистрация, компьютеризация и цифровая среда. Главная мысль работы состоит в том, что техника делает наблюдение более точным и проверяемым, если исследователь понимает, что именно измеряет его прибор.</w:t>
       </w:r>
     </w:p>
     <w:p>
       <w:pPr>
         <w:keepNext/>
         <w:pageBreakBefore/>
-        <w:spacing w:line="312" w:lineRule="auto" w:after="280" w:before="0"/>
+        <w:spacing w:line="360" w:lineRule="auto" w:after="280" w:before="0"/>
         <w:ind w:firstLine="709"/>
         <w:jc w:val="both"/>
         <w:outlineLvl w:val="0"/>
@@ -1613,7 +1613,7 @@
     </w:p>
     <w:p>
       <w:pPr>
-        <w:spacing w:line="312" w:lineRule="auto" w:after="0" w:before="0"/>
+        <w:spacing w:line="360" w:lineRule="auto" w:after="0" w:before="0"/>
         <w:ind w:firstLine="709"/>
         <w:jc w:val="both"/>
       </w:pPr>
@@ -1628,7 +1628,7 @@
     </w:p>
     <w:p>
       <w:pPr>
-        <w:spacing w:line="312" w:lineRule="auto" w:after="0" w:before="0"/>
+        <w:spacing w:line="360" w:lineRule="auto" w:after="0" w:before="0"/>
         <w:ind w:firstLine="709"/>
         <w:jc w:val="both"/>
       </w:pPr>
@@ -1643,22 +1643,22 @@
     </w:p>
     <w:p>
       <w:pPr>
-        <w:spacing w:line="312" w:lineRule="auto" w:after="0" w:before="0"/>
-        <w:ind w:firstLine="709"/>
-        <w:jc w:val="both"/>
-      </w:pPr>
-      <w:r>
-        <w:rPr>
-          <w:rFonts w:ascii="Times New Roman" w:hAnsi="Times New Roman" w:eastAsia="Times New Roman"/>
-          <w:b w:val="0"/>
-          <w:sz w:val="28"/>
-        </w:rPr>
-        <w:t>Главное изменение заключалось в организации опыта. Условия старались повторять: использовать одинаковый сигнал, давать понятную инструкцию, проводить несколько проб. Ответ участника превращался в запись, которую можно было сопоставить с другими результатами. Вместе с тем субъективные отчёты о переживаниях оставались частью исследований, поэтому появление приборов не означало исчезновения самоанализа.</w:t>
-      </w:r>
-    </w:p>
-    <w:p>
-      <w:pPr>
-        <w:spacing w:line="312" w:lineRule="auto" w:after="0" w:before="0"/>
+        <w:spacing w:line="360" w:lineRule="auto" w:after="0" w:before="0"/>
+        <w:ind w:firstLine="709"/>
+        <w:jc w:val="both"/>
+      </w:pPr>
+      <w:r>
+        <w:rPr>
+          <w:rFonts w:ascii="Times New Roman" w:hAnsi="Times New Roman" w:eastAsia="Times New Roman"/>
+          <w:b w:val="0"/>
+          <w:sz w:val="28"/>
+        </w:rPr>
+        <w:t>Главное изменение заключалось в организации опыта. Условия старались повторять: использовать одинаковый сигнал, давать понятную инструкцию, проводить несколько проб. Ответ участника превращался в запись, которую можно было сопоставить с другими результатами.</w:t>
+      </w:r>
+    </w:p>
+    <w:p>
+      <w:pPr>
+        <w:spacing w:line="360" w:lineRule="auto" w:after="0" w:before="0"/>
         <w:ind w:firstLine="709"/>
         <w:jc w:val="both"/>
       </w:pPr>
@@ -1673,24 +1673,24 @@
     </w:p>
     <w:p>
       <w:pPr>
-        <w:spacing w:line="312" w:lineRule="auto" w:after="0" w:before="0"/>
-        <w:ind w:firstLine="709"/>
-        <w:jc w:val="both"/>
-      </w:pPr>
-      <w:r>
-        <w:rPr>
-          <w:rFonts w:ascii="Times New Roman" w:hAnsi="Times New Roman" w:eastAsia="Times New Roman"/>
-          <w:b w:val="0"/>
-          <w:sz w:val="28"/>
-        </w:rPr>
-        <w:t>Первые лаборатории стали также местом обучения исследователей. Работа с оборудованием требовала навыков настройки, наблюдения и ведения протокола. Прибор постепенно превращался из необычного предмета в часть научной процедуры. Поэтому значение ранних лабораторий связано и с измерениями, и с формированием правил исследовательской работы.</w:t>
+        <w:spacing w:line="360" w:lineRule="auto" w:after="0" w:before="0"/>
+        <w:ind w:firstLine="709"/>
+        <w:jc w:val="both"/>
+      </w:pPr>
+      <w:r>
+        <w:rPr>
+          <w:rFonts w:ascii="Times New Roman" w:hAnsi="Times New Roman" w:eastAsia="Times New Roman"/>
+          <w:b w:val="0"/>
+          <w:sz w:val="28"/>
+        </w:rPr>
+        <w:t>Первые лаборатории стали также местом обучения исследователей. Работа с оборудованием требовала навыков настройки, наблюдения и ведения протокола. Поэтому значение ранних лабораторий связано и с измерениями, и с формированием правил исследовательской работы.</w:t>
       </w:r>
     </w:p>
     <w:p>
       <w:pPr>
         <w:keepNext/>
         <w:pageBreakBefore/>
-        <w:spacing w:line="312" w:lineRule="auto" w:after="280" w:before="0"/>
+        <w:spacing w:line="360" w:lineRule="auto" w:after="280" w:before="0"/>
         <w:ind w:firstLine="709"/>
         <w:jc w:val="both"/>
         <w:outlineLvl w:val="0"/>
@@ -1708,37 +1708,37 @@
     </w:p>
     <w:p>
       <w:pPr>
-        <w:spacing w:line="312" w:lineRule="auto" w:after="0" w:before="0"/>
-        <w:ind w:firstLine="709"/>
-        <w:jc w:val="both"/>
-      </w:pPr>
-      <w:r>
-        <w:rPr>
-          <w:rFonts w:ascii="Times New Roman" w:hAnsi="Times New Roman" w:eastAsia="Times New Roman"/>
-          <w:b w:val="0"/>
-          <w:sz w:val="28"/>
-        </w:rPr>
-        <w:t>В ранних психологических лабораториях использовали хронографы, хроноскопы, тахистоскопы, кимографы и другие устройства. Хроноскоп служил для измерения коротких временных промежутков. Тахистоскоп позволял ненадолго предъявить зрительный материал. Кимограф записывал изменения показателя на движущейся поверхности. Разные приборы решали разные задачи, хотя сегодня часть этих функций выполняет один компьютер [2].</w:t>
-      </w:r>
-    </w:p>
-    <w:p>
-      <w:pPr>
-        <w:spacing w:line="312" w:lineRule="auto" w:after="0" w:before="0"/>
-        <w:ind w:firstLine="709"/>
-        <w:jc w:val="both"/>
-      </w:pPr>
-      <w:r>
-        <w:rPr>
-          <w:rFonts w:ascii="Times New Roman" w:hAnsi="Times New Roman" w:eastAsia="Times New Roman"/>
-          <w:b w:val="0"/>
-          <w:sz w:val="28"/>
-        </w:rPr>
-        <w:t>Тахистоскоп особенно удобен для понимания связи техники и психологического вопроса. Если показывать буквы или изображение очень короткое время, можно изучать условия узнавания. Исследователя интересует не только правильность ответа, но и длительность предъявления. При обычном показе карточки рукой трудно обеспечить одинаковое время во всех попытках. Специальный механизм уменьшал такую неопределённость.</w:t>
-      </w:r>
-    </w:p>
-    <w:p>
-      <w:pPr>
-        <w:spacing w:line="312" w:lineRule="auto" w:after="0" w:before="0"/>
+        <w:spacing w:line="360" w:lineRule="auto" w:after="0" w:before="0"/>
+        <w:ind w:firstLine="709"/>
+        <w:jc w:val="both"/>
+      </w:pPr>
+      <w:r>
+        <w:rPr>
+          <w:rFonts w:ascii="Times New Roman" w:hAnsi="Times New Roman" w:eastAsia="Times New Roman"/>
+          <w:b w:val="0"/>
+          <w:sz w:val="28"/>
+        </w:rPr>
+        <w:t>В ранних психологических лабораториях использовали хронографы, хроноскопы, тахистоскопы, кимографы и другие устройства. Хроноскоп служил для измерения коротких временных промежутков. Тахистоскоп позволял ненадолго предъявить зрительный материал. Кимограф записывал изменения показателя на движущейся поверхности.</w:t>
+      </w:r>
+    </w:p>
+    <w:p>
+      <w:pPr>
+        <w:spacing w:line="360" w:lineRule="auto" w:after="0" w:before="0"/>
+        <w:ind w:firstLine="709"/>
+        <w:jc w:val="both"/>
+      </w:pPr>
+      <w:r>
+        <w:rPr>
+          <w:rFonts w:ascii="Times New Roman" w:hAnsi="Times New Roman" w:eastAsia="Times New Roman"/>
+          <w:b w:val="0"/>
+          <w:sz w:val="28"/>
+        </w:rPr>
+        <w:t>Тахистоскоп особенно удобен для понимания связи техники и психологического вопроса. Если показывать буквы или изображение очень короткое время, можно изучать условия узнавания. Исследователя интересует не только правильность ответа, но и длительность предъявления.</w:t>
+      </w:r>
+    </w:p>
+    <w:p>
+      <w:pPr>
+        <w:spacing w:line="360" w:lineRule="auto" w:after="0" w:before="0"/>
         <w:ind w:firstLine="709"/>
         <w:jc w:val="both"/>
       </w:pPr>
@@ -1753,7 +1753,7 @@
     </w:p>
     <w:p>
       <w:pPr>
-        <w:spacing w:line="312" w:lineRule="auto" w:after="0" w:before="0"/>
+        <w:spacing w:line="360" w:lineRule="auto" w:after="0" w:before="0"/>
         <w:ind w:firstLine="709"/>
         <w:jc w:val="both"/>
       </w:pPr>
@@ -1768,7 +1768,7 @@
     </w:p>
     <w:p>
       <w:pPr>
-        <w:spacing w:line="312" w:lineRule="auto" w:after="0" w:before="0"/>
+        <w:spacing w:line="360" w:lineRule="auto" w:after="0" w:before="0"/>
         <w:ind w:firstLine="709"/>
         <w:jc w:val="both"/>
       </w:pPr>
@@ -1785,7 +1785,7 @@
       <w:pPr>
         <w:keepNext/>
         <w:pageBreakBefore/>
-        <w:spacing w:line="312" w:lineRule="auto" w:after="280" w:before="0"/>
+        <w:spacing w:line="360" w:lineRule="auto" w:after="280" w:before="0"/>
         <w:ind w:firstLine="709"/>
         <w:jc w:val="both"/>
         <w:outlineLvl w:val="0"/>
@@ -1803,7 +1803,7 @@
     </w:p>
     <w:p>
       <w:pPr>
-        <w:spacing w:line="312" w:lineRule="auto" w:after="0" w:before="0"/>
+        <w:spacing w:line="360" w:lineRule="auto" w:after="0" w:before="0"/>
         <w:ind w:firstLine="709"/>
         <w:jc w:val="both"/>
       </w:pPr>
@@ -1818,7 +1818,7 @@
     </w:p>
     <w:p>
       <w:pPr>
-        <w:spacing w:line="312" w:lineRule="auto" w:after="0" w:before="0"/>
+        <w:spacing w:line="360" w:lineRule="auto" w:after="0" w:before="0"/>
         <w:ind w:firstLine="709"/>
         <w:jc w:val="both"/>
       </w:pPr>
@@ -1833,22 +1833,22 @@
     </w:p>
     <w:p>
       <w:pPr>
-        <w:spacing w:line="312" w:lineRule="auto" w:after="0" w:before="0"/>
-        <w:ind w:firstLine="709"/>
-        <w:jc w:val="both"/>
-      </w:pPr>
-      <w:r>
-        <w:rPr>
-          <w:rFonts w:ascii="Times New Roman" w:hAnsi="Times New Roman" w:eastAsia="Times New Roman"/>
-          <w:b w:val="0"/>
-          <w:sz w:val="28"/>
-        </w:rPr>
-        <w:t>При ЭЭГ электроды регистрируют разности электрических потенциалов. В психологическом исследовании запись можно сопоставить с моментами предъявления сигнала или ответа. Например, участник различает частые и редкие звуки, а исследователь изучает изменения сигнала, связанные с выполнением задания. Само наличие колебаний на экране ещё не объясняет, как человек воспринял звук.</w:t>
-      </w:r>
-    </w:p>
-    <w:p>
-      <w:pPr>
-        <w:spacing w:line="312" w:lineRule="auto" w:after="0" w:before="0"/>
+        <w:spacing w:line="360" w:lineRule="auto" w:after="0" w:before="0"/>
+        <w:ind w:firstLine="709"/>
+        <w:jc w:val="both"/>
+      </w:pPr>
+      <w:r>
+        <w:rPr>
+          <w:rFonts w:ascii="Times New Roman" w:hAnsi="Times New Roman" w:eastAsia="Times New Roman"/>
+          <w:b w:val="0"/>
+          <w:sz w:val="28"/>
+        </w:rPr>
+        <w:t>При ЭЭГ электроды регистрируют разности электрических потенциалов. В психологическом исследовании запись можно сопоставить с моментами предъявления сигнала или ответа.</w:t>
+      </w:r>
+    </w:p>
+    <w:p>
+      <w:pPr>
+        <w:spacing w:line="360" w:lineRule="auto" w:after="0" w:before="0"/>
         <w:ind w:firstLine="709"/>
         <w:jc w:val="both"/>
       </w:pPr>
@@ -1863,7 +1863,7 @@
     </w:p>
     <w:p>
       <w:pPr>
-        <w:spacing w:line="312" w:lineRule="auto" w:after="0" w:before="0"/>
+        <w:spacing w:line="360" w:lineRule="auto" w:after="0" w:before="0"/>
         <w:ind w:firstLine="709"/>
         <w:jc w:val="both"/>
       </w:pPr>
@@ -1880,7 +1880,7 @@
       <w:pPr>
         <w:keepNext/>
         <w:pageBreakBefore/>
-        <w:spacing w:line="312" w:lineRule="auto" w:after="280" w:before="0"/>
+        <w:spacing w:line="360" w:lineRule="auto" w:after="280" w:before="0"/>
         <w:ind w:firstLine="709"/>
         <w:jc w:val="both"/>
         <w:outlineLvl w:val="0"/>
@@ -1898,7 +1898,7 @@
     </w:p>
     <w:p>
       <w:pPr>
-        <w:spacing w:line="312" w:lineRule="auto" w:after="0" w:before="0"/>
+        <w:spacing w:line="360" w:lineRule="auto" w:after="0" w:before="0"/>
         <w:ind w:firstLine="709"/>
         <w:jc w:val="both"/>
       </w:pPr>
@@ -1913,7 +1913,7 @@
     </w:p>
     <w:p>
       <w:pPr>
-        <w:spacing w:line="312" w:lineRule="auto" w:after="0" w:before="0"/>
+        <w:spacing w:line="360" w:lineRule="auto" w:after="0" w:before="0"/>
         <w:ind w:firstLine="709"/>
         <w:jc w:val="both"/>
       </w:pPr>
@@ -1928,22 +1928,22 @@
     </w:p>
     <w:p>
       <w:pPr>
-        <w:spacing w:line="312" w:lineRule="auto" w:after="0" w:before="0"/>
-        <w:ind w:firstLine="709"/>
-        <w:jc w:val="both"/>
-      </w:pPr>
-      <w:r>
-        <w:rPr>
-          <w:rFonts w:ascii="Times New Roman" w:hAnsi="Times New Roman" w:eastAsia="Times New Roman"/>
-          <w:b w:val="0"/>
-          <w:sz w:val="28"/>
-        </w:rPr>
-        <w:t>Автоматизация уменьшает количество ручных действий. Например, программа может менять порядок заданий и сразу сохранять ответы. Но ошибка, однажды заложенная в код, способна повториться у всех участников. Если в таблицу неверно записывается название условия, большой объём данных только увеличивает последствия этой ошибки. Поэтому перед исследованием нужны пробные запуски.</w:t>
-      </w:r>
-    </w:p>
-    <w:p>
-      <w:pPr>
-        <w:spacing w:line="312" w:lineRule="auto" w:after="0" w:before="0"/>
+        <w:spacing w:line="360" w:lineRule="auto" w:after="0" w:before="0"/>
+        <w:ind w:firstLine="709"/>
+        <w:jc w:val="both"/>
+      </w:pPr>
+      <w:r>
+        <w:rPr>
+          <w:rFonts w:ascii="Times New Roman" w:hAnsi="Times New Roman" w:eastAsia="Times New Roman"/>
+          <w:b w:val="0"/>
+          <w:sz w:val="28"/>
+        </w:rPr>
+        <w:t>Автоматизация уменьшает количество ручных действий. Например, программа может менять порядок заданий и сразу сохранять ответы. Но ошибка, однажды заложенная в код, способна повториться у всех участников. Поэтому перед исследованием нужны пробные запуски.</w:t>
+      </w:r>
+    </w:p>
+    <w:p>
+      <w:pPr>
+        <w:spacing w:line="360" w:lineRule="auto" w:after="0" w:before="0"/>
         <w:ind w:firstLine="709"/>
         <w:jc w:val="both"/>
       </w:pPr>
@@ -1958,7 +1958,7 @@
     </w:p>
     <w:p>
       <w:pPr>
-        <w:spacing w:line="312" w:lineRule="auto" w:after="0" w:before="0"/>
+        <w:spacing w:line="360" w:lineRule="auto" w:after="0" w:before="0"/>
         <w:ind w:firstLine="709"/>
         <w:jc w:val="both"/>
       </w:pPr>
@@ -1975,7 +1975,7 @@
       <w:pPr>
         <w:keepNext/>
         <w:pageBreakBefore/>
-        <w:spacing w:line="312" w:lineRule="auto" w:after="280" w:before="0"/>
+        <w:spacing w:line="360" w:lineRule="auto" w:after="280" w:before="0"/>
         <w:ind w:firstLine="709"/>
         <w:jc w:val="both"/>
         <w:outlineLvl w:val="0"/>
@@ -1993,22 +1993,22 @@
     </w:p>
     <w:p>
       <w:pPr>
-        <w:spacing w:line="312" w:lineRule="auto" w:after="0" w:before="0"/>
-        <w:ind w:firstLine="709"/>
-        <w:jc w:val="both"/>
-      </w:pPr>
-      <w:r>
-        <w:rPr>
-          <w:rFonts w:ascii="Times New Roman" w:hAnsi="Times New Roman" w:eastAsia="Times New Roman"/>
-          <w:b w:val="0"/>
-          <w:sz w:val="28"/>
-        </w:rPr>
-        <w:t>Современная психологическая лаборатория может объединять несколько способов наблюдения. Одни инструменты регистрируют поведенческий ответ, другие — движения глаз или показатели работы мозга. Выбор зависит от вопроса. Если нужно понять, куда человек смотрит при чтении, регистрация взгляда будет непосредственно связана с задачей. Для изучения мозговых процессов потребуется другой метод.</w:t>
-      </w:r>
-    </w:p>
-    <w:p>
-      <w:pPr>
-        <w:spacing w:line="312" w:lineRule="auto" w:after="0" w:before="0"/>
+        <w:spacing w:line="360" w:lineRule="auto" w:after="0" w:before="0"/>
+        <w:ind w:firstLine="709"/>
+        <w:jc w:val="both"/>
+      </w:pPr>
+      <w:r>
+        <w:rPr>
+          <w:rFonts w:ascii="Times New Roman" w:hAnsi="Times New Roman" w:eastAsia="Times New Roman"/>
+          <w:b w:val="0"/>
+          <w:sz w:val="28"/>
+        </w:rPr>
+        <w:t>Современная психологическая лаборатория может объединять несколько способов наблюдения. Одни инструменты регистрируют поведенческий ответ, другие — движения глаз или показатели работы мозга. Выбор зависит от вопроса. Если нужно понять, куда человек смотрит при чтении, регистрация взгляда будет непосредственно связана с задачей.</w:t>
+      </w:r>
+    </w:p>
+    <w:p>
+      <w:pPr>
+        <w:spacing w:line="360" w:lineRule="auto" w:after="0" w:before="0"/>
         <w:ind w:firstLine="709"/>
         <w:jc w:val="both"/>
       </w:pPr>
@@ -2023,22 +2023,22 @@
     </w:p>
     <w:p>
       <w:pPr>
-        <w:spacing w:line="312" w:lineRule="auto" w:after="0" w:before="0"/>
-        <w:ind w:firstLine="709"/>
-        <w:jc w:val="both"/>
-      </w:pPr>
-      <w:r>
-        <w:rPr>
-          <w:rFonts w:ascii="Times New Roman" w:hAnsi="Times New Roman" w:eastAsia="Times New Roman"/>
-          <w:b w:val="0"/>
-          <w:sz w:val="28"/>
-        </w:rPr>
-        <w:t>Например, человек долго смотрит на один абзац. Это может означать интерес, трудность чтения или попытку найти нужную строку. Сама длительная фиксация не выбирает одно из объяснений. Чтобы разобраться, можно добавить вопросы по тексту и данные о выполнении задания. Такой пример помогает избежать слишком прямого вывода из движения глаза о содержании мысли.</w:t>
-      </w:r>
-    </w:p>
-    <w:p>
-      <w:pPr>
-        <w:spacing w:line="312" w:lineRule="auto" w:after="0" w:before="0"/>
+        <w:spacing w:line="360" w:lineRule="auto" w:after="0" w:before="0"/>
+        <w:ind w:firstLine="709"/>
+        <w:jc w:val="both"/>
+      </w:pPr>
+      <w:r>
+        <w:rPr>
+          <w:rFonts w:ascii="Times New Roman" w:hAnsi="Times New Roman" w:eastAsia="Times New Roman"/>
+          <w:b w:val="0"/>
+          <w:sz w:val="28"/>
+        </w:rPr>
+        <w:t>Например, человек долго смотрит на один абзац. Это может означать интерес, трудность чтения или попытку найти нужную строку. Сама длительная фиксация не выбирает одно из объяснений. Чтобы разобраться, можно добавить вопросы по тексту и данные о выполнении задания.</w:t>
+      </w:r>
+    </w:p>
+    <w:p>
+      <w:pPr>
+        <w:spacing w:line="360" w:lineRule="auto" w:after="0" w:before="0"/>
         <w:ind w:firstLine="709"/>
         <w:jc w:val="both"/>
       </w:pPr>
@@ -2053,24 +2053,24 @@
     </w:p>
     <w:p>
       <w:pPr>
-        <w:spacing w:line="312" w:lineRule="auto" w:after="0" w:before="0"/>
-        <w:ind w:firstLine="709"/>
-        <w:jc w:val="both"/>
-      </w:pPr>
-      <w:r>
-        <w:rPr>
-          <w:rFonts w:ascii="Times New Roman" w:hAnsi="Times New Roman" w:eastAsia="Times New Roman"/>
-          <w:b w:val="0"/>
-          <w:sz w:val="28"/>
-        </w:rPr>
-        <w:t>Поэтому красивое изображение мозга нельзя считать доказательством само по себе. Нужно знать, какое сравнение проводилось, как обработали данные и какие ограничения имеет вывод. Р. Полдрак и соавторы подчёркивают значение прозрачного описания методов, проверки программ и доступности данных и кода [9]. Техническая сложность исследования повышает требования к проверке, а не отменяет их.</w:t>
+        <w:spacing w:line="360" w:lineRule="auto" w:after="0" w:before="0"/>
+        <w:ind w:firstLine="709"/>
+        <w:jc w:val="both"/>
+      </w:pPr>
+      <w:r>
+        <w:rPr>
+          <w:rFonts w:ascii="Times New Roman" w:hAnsi="Times New Roman" w:eastAsia="Times New Roman"/>
+          <w:b w:val="0"/>
+          <w:sz w:val="28"/>
+        </w:rPr>
+        <w:t>Поэтому красивое изображение мозга нельзя считать доказательством само по себе. Нужно знать, какое сравнение проводилось, как обработали данные и какие ограничения имеет вывод. Р. Полдрак и соавторы подчёркивают значение прозрачного описания методов, проверки программ и доступности данных и кода [9].</w:t>
       </w:r>
     </w:p>
     <w:p>
       <w:pPr>
         <w:keepNext/>
         <w:pageBreakBefore/>
-        <w:spacing w:line="312" w:lineRule="auto" w:after="280" w:before="0"/>
+        <w:spacing w:line="360" w:lineRule="auto" w:after="280" w:before="0"/>
         <w:ind w:firstLine="709"/>
         <w:jc w:val="both"/>
         <w:outlineLvl w:val="0"/>
@@ -2088,7 +2088,7 @@
     </w:p>
     <w:p>
       <w:pPr>
-        <w:spacing w:line="312" w:lineRule="auto" w:after="0" w:before="0"/>
+        <w:spacing w:line="360" w:lineRule="auto" w:after="0" w:before="0"/>
         <w:ind w:firstLine="709"/>
         <w:jc w:val="both"/>
       </w:pPr>
@@ -2103,7 +2103,7 @@
     </w:p>
     <w:p>
       <w:pPr>
-        <w:spacing w:line="312" w:lineRule="auto" w:after="0" w:before="0"/>
+        <w:spacing w:line="360" w:lineRule="auto" w:after="0" w:before="0"/>
         <w:ind w:firstLine="709"/>
         <w:jc w:val="both"/>
       </w:pPr>
@@ -2118,22 +2118,22 @@
     </w:p>
     <w:p>
       <w:pPr>
-        <w:spacing w:line="312" w:lineRule="auto" w:after="0" w:before="0"/>
-        <w:ind w:firstLine="709"/>
-        <w:jc w:val="both"/>
-      </w:pPr>
-      <w:r>
-        <w:rPr>
-          <w:rFonts w:ascii="Times New Roman" w:hAnsi="Times New Roman" w:eastAsia="Times New Roman"/>
-          <w:b w:val="0"/>
-          <w:sz w:val="28"/>
-        </w:rPr>
-        <w:t>Представим, что один участник выполняет задание в тихой комнате, а другой — в транспорте. Разница ответов может быть связана с обстановкой, а не с изучаемым свойством. Поэтому для онлайн-работы полезны понятная инструкция, тренировочный блок и ограничения на подходящие устройства. Исследователь также должен заранее определить правила работы с незавершёнными ответами.</w:t>
-      </w:r>
-    </w:p>
-    <w:p>
-      <w:pPr>
-        <w:spacing w:line="312" w:lineRule="auto" w:after="0" w:before="0"/>
+        <w:spacing w:line="360" w:lineRule="auto" w:after="0" w:before="0"/>
+        <w:ind w:firstLine="709"/>
+        <w:jc w:val="both"/>
+      </w:pPr>
+      <w:r>
+        <w:rPr>
+          <w:rFonts w:ascii="Times New Roman" w:hAnsi="Times New Roman" w:eastAsia="Times New Roman"/>
+          <w:b w:val="0"/>
+          <w:sz w:val="28"/>
+        </w:rPr>
+        <w:t>Представим, что один участник выполняет задание в тихой комнате, а другой — в транспорте. Разница ответов может быть связана с обстановкой, а не с изучаемым свойством. Поэтому для онлайн-работы полезны понятная инструкция, тренировочный блок и ограничения на подходящие устройства.</w:t>
+      </w:r>
+    </w:p>
+    <w:p>
+      <w:pPr>
+        <w:spacing w:line="360" w:lineRule="auto" w:after="0" w:before="0"/>
         <w:ind w:firstLine="709"/>
         <w:jc w:val="both"/>
       </w:pPr>
@@ -2148,7 +2148,7 @@
     </w:p>
     <w:p>
       <w:pPr>
-        <w:spacing w:line="312" w:lineRule="auto" w:after="0" w:before="0"/>
+        <w:spacing w:line="360" w:lineRule="auto" w:after="0" w:before="0"/>
         <w:ind w:firstLine="709"/>
         <w:jc w:val="both"/>
       </w:pPr>
@@ -2165,7 +2165,7 @@
       <w:pPr>
         <w:keepNext/>
         <w:pageBreakBefore/>
-        <w:spacing w:line="312" w:lineRule="auto" w:after="280" w:before="0"/>
+        <w:spacing w:line="360" w:lineRule="auto" w:after="280" w:before="0"/>
         <w:ind w:firstLine="709"/>
         <w:jc w:val="both"/>
         <w:outlineLvl w:val="0"/>
@@ -2183,22 +2183,22 @@
     </w:p>
     <w:p>
       <w:pPr>
-        <w:spacing w:line="312" w:lineRule="auto" w:after="0" w:before="0"/>
-        <w:ind w:firstLine="709"/>
-        <w:jc w:val="both"/>
-      </w:pPr>
-      <w:r>
-        <w:rPr>
-          <w:rFonts w:ascii="Times New Roman" w:hAnsi="Times New Roman" w:eastAsia="Times New Roman"/>
-          <w:b w:val="0"/>
-          <w:sz w:val="28"/>
-        </w:rPr>
-        <w:t>Виртуальная реальность позволяет предъявлять человеку не отдельную картинку, а управляемую цифровую ситуацию. Участник может осматриваться и действовать внутри созданной сцены. Исследователь при этом задаёт условия: расположение объектов, поведение персонажей или последовательность событий. Благодаря этому появляется промежуточный вариант между простым экранным заданием и наблюдением в обычной жизни.</w:t>
-      </w:r>
-    </w:p>
-    <w:p>
-      <w:pPr>
-        <w:spacing w:line="312" w:lineRule="auto" w:after="0" w:before="0"/>
+        <w:spacing w:line="360" w:lineRule="auto" w:after="0" w:before="0"/>
+        <w:ind w:firstLine="709"/>
+        <w:jc w:val="both"/>
+      </w:pPr>
+      <w:r>
+        <w:rPr>
+          <w:rFonts w:ascii="Times New Roman" w:hAnsi="Times New Roman" w:eastAsia="Times New Roman"/>
+          <w:b w:val="0"/>
+          <w:sz w:val="28"/>
+        </w:rPr>
+        <w:t>Виртуальная реальность позволяет предъявлять человеку не отдельную картинку, а управляемую цифровую ситуацию. Участник может осматриваться и действовать внутри созданной сцены. Исследователь при этом задаёт условия: расположение объектов, поведение персонажей или последовательность событий.</w:t>
+      </w:r>
+    </w:p>
+    <w:p>
+      <w:pPr>
+        <w:spacing w:line="360" w:lineRule="auto" w:after="0" w:before="0"/>
         <w:ind w:firstLine="709"/>
         <w:jc w:val="both"/>
       </w:pPr>
@@ -2213,22 +2213,22 @@
     </w:p>
     <w:p>
       <w:pPr>
-        <w:spacing w:line="312" w:lineRule="auto" w:after="0" w:before="0"/>
-        <w:ind w:firstLine="709"/>
-        <w:jc w:val="both"/>
-      </w:pPr>
-      <w:r>
-        <w:rPr>
-          <w:rFonts w:ascii="Times New Roman" w:hAnsi="Times New Roman" w:eastAsia="Times New Roman"/>
-          <w:b w:val="0"/>
-          <w:sz w:val="28"/>
-        </w:rPr>
-        <w:t>Для объяснения можно представить исследование выступления перед аудиторией. В виртуальной сцене слушатели могут смотреть на выступающего или отвлекаться. Условия легче повторить для разных участников, чем попросить настоящую аудиторию каждый раз вести себя одинаково. Это учебная иллюстрация возможностей метода, а не описание эксперимента, проведённого в рамках реферата.</w:t>
-      </w:r>
-    </w:p>
-    <w:p>
-      <w:pPr>
-        <w:spacing w:line="312" w:lineRule="auto" w:after="0" w:before="0"/>
+        <w:spacing w:line="360" w:lineRule="auto" w:after="0" w:before="0"/>
+        <w:ind w:firstLine="709"/>
+        <w:jc w:val="both"/>
+      </w:pPr>
+      <w:r>
+        <w:rPr>
+          <w:rFonts w:ascii="Times New Roman" w:hAnsi="Times New Roman" w:eastAsia="Times New Roman"/>
+          <w:b w:val="0"/>
+          <w:sz w:val="28"/>
+        </w:rPr>
+        <w:t>Для объяснения можно представить исследование выступления перед аудиторией. В виртуальной сцене слушатели могут смотреть на выступающего или отвлекаться. Условия легче повторить для разных участников, чем попросить настоящую аудиторию каждый раз вести себя одинаково.</w:t>
+      </w:r>
+    </w:p>
+    <w:p>
+      <w:pPr>
+        <w:spacing w:line="360" w:lineRule="auto" w:after="0" w:before="0"/>
         <w:ind w:firstLine="709"/>
         <w:jc w:val="both"/>
       </w:pPr>
@@ -2243,24 +2243,24 @@
     </w:p>
     <w:p>
       <w:pPr>
-        <w:spacing w:line="312" w:lineRule="auto" w:after="0" w:before="0"/>
-        <w:ind w:firstLine="709"/>
-        <w:jc w:val="both"/>
-      </w:pPr>
-      <w:r>
-        <w:rPr>
-          <w:rFonts w:ascii="Times New Roman" w:hAnsi="Times New Roman" w:eastAsia="Times New Roman"/>
-          <w:b w:val="0"/>
-          <w:sz w:val="28"/>
-        </w:rPr>
-        <w:t>Сочетание устройств даёт больше показателей, но усложняет процедуру. Если взгляд, движение головы и события сцены записаны с разными временными отметками, сопоставление может оказаться неверным. Кроме того, участнику может быть неудобно в шлеме. Поэтому полезно сначала проверить небольшую процедуру и убедиться, что дополнительные датчики действительно помогают ответить на вопрос, а не просто увеличивают количество файлов.</w:t>
+        <w:spacing w:line="360" w:lineRule="auto" w:after="0" w:before="0"/>
+        <w:ind w:firstLine="709"/>
+        <w:jc w:val="both"/>
+      </w:pPr>
+      <w:r>
+        <w:rPr>
+          <w:rFonts w:ascii="Times New Roman" w:hAnsi="Times New Roman" w:eastAsia="Times New Roman"/>
+          <w:b w:val="0"/>
+          <w:sz w:val="28"/>
+        </w:rPr>
+        <w:t>Сочетание устройств даёт больше показателей, но усложняет процедуру. Если взгляд, движение головы и события сцены записаны с разными временными отметками, сопоставление может оказаться неверным. Поэтому полезно сначала проверить небольшую процедуру и убедиться, что дополнительные датчики действительно помогают ответить на вопрос, а не просто увеличивают количество файлов.</w:t>
       </w:r>
     </w:p>
     <w:p>
       <w:pPr>
         <w:keepNext/>
         <w:pageBreakBefore/>
-        <w:spacing w:line="312" w:lineRule="auto" w:after="280" w:before="0"/>
+        <w:spacing w:line="360" w:lineRule="auto" w:after="280" w:before="0"/>
         <w:ind w:firstLine="709"/>
         <w:jc w:val="both"/>
         <w:outlineLvl w:val="0"/>
@@ -2278,7 +2278,7 @@
     </w:p>
     <w:p>
       <w:pPr>
-        <w:spacing w:line="312" w:lineRule="auto" w:after="0" w:before="0"/>
+        <w:spacing w:line="360" w:lineRule="auto" w:after="0" w:before="0"/>
         <w:ind w:firstLine="709"/>
         <w:jc w:val="both"/>
       </w:pPr>
@@ -2293,67 +2293,67 @@
     </w:p>
     <w:p>
       <w:pPr>
-        <w:spacing w:line="312" w:lineRule="auto" w:after="0" w:before="0"/>
-        <w:ind w:firstLine="709"/>
-        <w:jc w:val="both"/>
-      </w:pPr>
-      <w:r>
-        <w:rPr>
-          <w:rFonts w:ascii="Times New Roman" w:hAnsi="Times New Roman" w:eastAsia="Times New Roman"/>
-          <w:b w:val="0"/>
-          <w:sz w:val="28"/>
-        </w:rPr>
-        <w:t>Например, датчик может очень точно измерить пульс. Однако учащение пульса само по себе не устанавливает причину: человек мог волноваться, двигаться или только что подняться по лестнице. В учебном исследовании необходимо записывать условия и сопоставлять несколько объяснений. Иначе точное число получит слишком широкое толкование.</w:t>
-      </w:r>
-    </w:p>
-    <w:p>
-      <w:pPr>
-        <w:spacing w:line="312" w:lineRule="auto" w:after="0" w:before="0"/>
-        <w:ind w:firstLine="709"/>
-        <w:jc w:val="both"/>
-      </w:pPr>
-      <w:r>
-        <w:rPr>
-          <w:rFonts w:ascii="Times New Roman" w:hAnsi="Times New Roman" w:eastAsia="Times New Roman"/>
-          <w:b w:val="0"/>
-          <w:sz w:val="28"/>
-        </w:rPr>
-        <w:t>Один из способов сделать выводы понятнее — заранее сформулировать исследовательский вопрос и план анализа. Б. Носек и соавторы объясняют значение предварительной регистрации: она помогает отличать проверку заранее заявленного предположения от поиска интересных связей в уже полученных данных [15]. Оба типа работы могут быть полезны, если исследователь честно сообщает, что именно он сделал.</w:t>
-      </w:r>
-    </w:p>
-    <w:p>
-      <w:pPr>
-        <w:spacing w:line="312" w:lineRule="auto" w:after="0" w:before="0"/>
-        <w:ind w:firstLine="709"/>
-        <w:jc w:val="both"/>
-      </w:pPr>
-      <w:r>
-        <w:rPr>
-          <w:rFonts w:ascii="Times New Roman" w:hAnsi="Times New Roman" w:eastAsia="Times New Roman"/>
-          <w:b w:val="0"/>
-          <w:sz w:val="28"/>
-        </w:rPr>
-        <w:t>Для учебного проекта это означает простые действия. До сбора данных нужно решить, что сравнивать, какой показатель считать основным и какие ответы исключать. После завершения следует сохранить исходные записи и описать изменения плана. Даже небольшой эксперимент становится понятнее, когда другой человек способен восстановить ход работы.</w:t>
-      </w:r>
-    </w:p>
-    <w:p>
-      <w:pPr>
-        <w:spacing w:line="312" w:lineRule="auto" w:after="0" w:before="0"/>
-        <w:ind w:firstLine="709"/>
-        <w:jc w:val="both"/>
-      </w:pPr>
-      <w:r>
-        <w:rPr>
-          <w:rFonts w:ascii="Times New Roman" w:hAnsi="Times New Roman" w:eastAsia="Times New Roman"/>
-          <w:b w:val="0"/>
-          <w:sz w:val="28"/>
-        </w:rPr>
-        <w:t>Этическая сторона особенно заметна при записи видео, взгляда и перемещений. Участник должен понимать, какие сведения собирают и для чего их используют. Не следует включать запись лишних данных только потому, что устройство это умеет. Доступ к файлам нужно ограничивать, а идентифицирующие сведения отделять от исследовательской таблицы. Эти меры являются разумными принципами организации работы, а не заменой правилам конкретного учреждения.</w:t>
-      </w:r>
-    </w:p>
-    <w:p>
-      <w:pPr>
-        <w:spacing w:line="312" w:lineRule="auto" w:after="0" w:before="0"/>
+        <w:spacing w:line="360" w:lineRule="auto" w:after="0" w:before="0"/>
+        <w:ind w:firstLine="709"/>
+        <w:jc w:val="both"/>
+      </w:pPr>
+      <w:r>
+        <w:rPr>
+          <w:rFonts w:ascii="Times New Roman" w:hAnsi="Times New Roman" w:eastAsia="Times New Roman"/>
+          <w:b w:val="0"/>
+          <w:sz w:val="28"/>
+        </w:rPr>
+        <w:t>Например, датчик может очень точно измерить пульс. Однако учащение пульса само по себе не устанавливает причину: человек мог волноваться, двигаться или только что подняться по лестнице. В учебном исследовании необходимо записывать условия и сопоставлять несколько объяснений.</w:t>
+      </w:r>
+    </w:p>
+    <w:p>
+      <w:pPr>
+        <w:spacing w:line="360" w:lineRule="auto" w:after="0" w:before="0"/>
+        <w:ind w:firstLine="709"/>
+        <w:jc w:val="both"/>
+      </w:pPr>
+      <w:r>
+        <w:rPr>
+          <w:rFonts w:ascii="Times New Roman" w:hAnsi="Times New Roman" w:eastAsia="Times New Roman"/>
+          <w:b w:val="0"/>
+          <w:sz w:val="28"/>
+        </w:rPr>
+        <w:t>Один из способов сделать выводы понятнее — заранее сформулировать исследовательский вопрос и план анализа. Б. Носек и соавторы объясняют значение предварительной регистрации: она помогает отличать проверку заранее заявленного предположения от поиска интересных связей в уже полученных данных [15].</w:t>
+      </w:r>
+    </w:p>
+    <w:p>
+      <w:pPr>
+        <w:spacing w:line="360" w:lineRule="auto" w:after="0" w:before="0"/>
+        <w:ind w:firstLine="709"/>
+        <w:jc w:val="both"/>
+      </w:pPr>
+      <w:r>
+        <w:rPr>
+          <w:rFonts w:ascii="Times New Roman" w:hAnsi="Times New Roman" w:eastAsia="Times New Roman"/>
+          <w:b w:val="0"/>
+          <w:sz w:val="28"/>
+        </w:rPr>
+        <w:t>Для учебного проекта это означает простые действия. До сбора данных нужно решить, что сравнивать, какой показатель считать основным и какие ответы исключать. После завершения следует сохранить исходные записи и описать изменения плана.</w:t>
+      </w:r>
+    </w:p>
+    <w:p>
+      <w:pPr>
+        <w:spacing w:line="360" w:lineRule="auto" w:after="0" w:before="0"/>
+        <w:ind w:firstLine="709"/>
+        <w:jc w:val="both"/>
+      </w:pPr>
+      <w:r>
+        <w:rPr>
+          <w:rFonts w:ascii="Times New Roman" w:hAnsi="Times New Roman" w:eastAsia="Times New Roman"/>
+          <w:b w:val="0"/>
+          <w:sz w:val="28"/>
+        </w:rPr>
+        <w:t>Этическая сторона особенно заметна при записи видео, взгляда и перемещений. Участник должен понимать, какие сведения собирают и для чего их используют. Не следует включать запись лишних данных только потому, что устройство это умеет. Доступ к файлам нужно ограничивать, а идентифицирующие сведения отделять от исследовательской таблицы.</w:t>
+      </w:r>
+    </w:p>
+    <w:p>
+      <w:pPr>
+        <w:spacing w:line="360" w:lineRule="auto" w:after="0" w:before="0"/>
         <w:ind w:firstLine="709"/>
         <w:jc w:val="both"/>
       </w:pPr>
@@ -2370,7 +2370,7 @@
       <w:pPr>
         <w:keepNext/>
         <w:pageBreakBefore/>
-        <w:spacing w:line="312" w:lineRule="auto" w:after="280" w:before="0"/>
+        <w:spacing w:line="360" w:lineRule="auto" w:after="280" w:before="0"/>
         <w:ind w:firstLine="709"/>
         <w:jc w:val="both"/>
         <w:outlineLvl w:val="0"/>
@@ -2388,7 +2388,7 @@
     </w:p>
     <w:p>
       <w:pPr>
-        <w:spacing w:line="312" w:lineRule="auto" w:after="0" w:before="0"/>
+        <w:spacing w:line="360" w:lineRule="auto" w:after="0" w:before="0"/>
         <w:ind w:firstLine="709"/>
         <w:jc w:val="both"/>
       </w:pPr>
@@ -2403,69 +2403,69 @@
     </w:p>
     <w:p>
       <w:pPr>
-        <w:spacing w:line="312" w:lineRule="auto" w:after="0" w:before="0"/>
-        <w:ind w:firstLine="709"/>
-        <w:jc w:val="both"/>
-      </w:pPr>
-      <w:r>
-        <w:rPr>
-          <w:rFonts w:ascii="Times New Roman" w:hAnsi="Times New Roman" w:eastAsia="Times New Roman"/>
-          <w:b w:val="0"/>
-          <w:sz w:val="28"/>
-        </w:rPr>
-        <w:t>При этом история не выглядит как простая замена плохого старого прибора хорошим новым. У каждого инструмента есть собственная область применения. Кнопочный ответ может быть достаточен для одного вопроса, тогда как другой потребует регистрации взгляда или мозгового сигнала. Выбирать средство следует по задаче, а не по его сложности или внешней эффектности.</w:t>
-      </w:r>
-    </w:p>
-    <w:p>
-      <w:pPr>
-        <w:spacing w:line="312" w:lineRule="auto" w:after="0" w:before="0"/>
-        <w:ind w:firstLine="709"/>
-        <w:jc w:val="both"/>
-      </w:pPr>
-      <w:r>
-        <w:rPr>
-          <w:rFonts w:ascii="Times New Roman" w:hAnsi="Times New Roman" w:eastAsia="Times New Roman"/>
-          <w:b w:val="0"/>
-          <w:sz w:val="28"/>
-        </w:rPr>
-        <w:t>На мой взгляд, главное достижение техники в психологии — возможность сделать наблюдение более конкретным. Вместо фразы «участник долго думал» можно указать время ответа и условия задания. Вместо общего впечатления о чтении можно изучить, как человек рассматривал материал и насколько хорошо его понял. Такие данные позволяют обсуждать выводы предметно, хотя сами по себе не раскрывают всю внутреннюю жизнь человека.</w:t>
-      </w:r>
-    </w:p>
-    <w:p>
-      <w:pPr>
-        <w:spacing w:line="312" w:lineRule="auto" w:after="0" w:before="0"/>
-        <w:ind w:firstLine="709"/>
-        <w:jc w:val="both"/>
-      </w:pPr>
-      <w:r>
-        <w:rPr>
-          <w:rFonts w:ascii="Times New Roman" w:hAnsi="Times New Roman" w:eastAsia="Times New Roman"/>
-          <w:b w:val="0"/>
-          <w:sz w:val="28"/>
-        </w:rPr>
-        <w:t>Рассмотренные источники также показывают значение проверки. Настройка оборудования, понятные правила анализа и описание ограничений нужны на любом историческом этапе. Современные технологии не освобождают от этой работы, а часто делают её сложнее. Особенно важно помнить об этом, когда результаты выглядят убедительно из-за красочного графика или изображения мозга.</w:t>
-      </w:r>
-    </w:p>
-    <w:p>
-      <w:pPr>
-        <w:spacing w:line="312" w:lineRule="auto" w:after="0" w:before="0"/>
-        <w:ind w:firstLine="709"/>
-        <w:jc w:val="both"/>
-      </w:pPr>
-      <w:r>
-        <w:rPr>
-          <w:rFonts w:ascii="Times New Roman" w:hAnsi="Times New Roman" w:eastAsia="Times New Roman"/>
-          <w:b w:val="0"/>
-          <w:sz w:val="28"/>
-        </w:rPr>
-        <w:t>Таким образом, поставленная цель достигнута: прослежены основные изменения исследовательской техники и показана их связь с возможностями психологии. Перспективы связаны с сочетанием методов и изучением поведения в естественной среде. Польза этих решений будет зависеть от того, насколько точно поставлен вопрос, надёжно организовано измерение и бережно выстроено взаимодействие с участником.</w:t>
+        <w:spacing w:line="360" w:lineRule="auto" w:after="0" w:before="0"/>
+        <w:ind w:firstLine="709"/>
+        <w:jc w:val="both"/>
+      </w:pPr>
+      <w:r>
+        <w:rPr>
+          <w:rFonts w:ascii="Times New Roman" w:hAnsi="Times New Roman" w:eastAsia="Times New Roman"/>
+          <w:b w:val="0"/>
+          <w:sz w:val="28"/>
+        </w:rPr>
+        <w:t>При этом история не выглядит как простая замена плохого старого прибора хорошим новым. У каждого инструмента есть собственная область применения. Кнопочный ответ может быть достаточен для одного вопроса, тогда как другой потребует регистрации взгляда или мозгового сигнала.</w:t>
+      </w:r>
+    </w:p>
+    <w:p>
+      <w:pPr>
+        <w:spacing w:line="360" w:lineRule="auto" w:after="0" w:before="0"/>
+        <w:ind w:firstLine="709"/>
+        <w:jc w:val="both"/>
+      </w:pPr>
+      <w:r>
+        <w:rPr>
+          <w:rFonts w:ascii="Times New Roman" w:hAnsi="Times New Roman" w:eastAsia="Times New Roman"/>
+          <w:b w:val="0"/>
+          <w:sz w:val="28"/>
+        </w:rPr>
+        <w:t>На мой взгляд, главное достижение техники в психологии — возможность сделать наблюдение более конкретным. Вместо фразы «участник долго думал» можно указать время ответа и условия задания. Такие данные позволяют обсуждать выводы предметно, хотя сами по себе не раскрывают всю внутреннюю жизнь человека.</w:t>
+      </w:r>
+    </w:p>
+    <w:p>
+      <w:pPr>
+        <w:spacing w:line="360" w:lineRule="auto" w:after="0" w:before="0"/>
+        <w:ind w:firstLine="709"/>
+        <w:jc w:val="both"/>
+      </w:pPr>
+      <w:r>
+        <w:rPr>
+          <w:rFonts w:ascii="Times New Roman" w:hAnsi="Times New Roman" w:eastAsia="Times New Roman"/>
+          <w:b w:val="0"/>
+          <w:sz w:val="28"/>
+        </w:rPr>
+        <w:t>Рассмотренные источники также показывают значение проверки. Настройка оборудования, понятные правила анализа и описание ограничений нужны на любом историческом этапе. Современные технологии не освобождают от этой работы, а часто делают её сложнее.</w:t>
+      </w:r>
+    </w:p>
+    <w:p>
+      <w:pPr>
+        <w:spacing w:line="360" w:lineRule="auto" w:after="0" w:before="0"/>
+        <w:ind w:firstLine="709"/>
+        <w:jc w:val="both"/>
+      </w:pPr>
+      <w:r>
+        <w:rPr>
+          <w:rFonts w:ascii="Times New Roman" w:hAnsi="Times New Roman" w:eastAsia="Times New Roman"/>
+          <w:b w:val="0"/>
+          <w:sz w:val="28"/>
+        </w:rPr>
+        <w:t>Таким образом, поставленная цель достигнута: прослежены основные изменения исследовательской техники и показана их связь с возможностями психологии. Польза этих решений будет зависеть от того, насколько точно поставлен вопрос, надёжно организовано измерение и бережно выстроено взаимодействие с участником.</w:t>
       </w:r>
     </w:p>
     <w:p>
       <w:pPr>
         <w:keepNext/>
         <w:pageBreakBefore/>
-        <w:spacing w:line="312" w:lineRule="auto" w:after="280" w:before="0"/>
+        <w:spacing w:line="360" w:lineRule="auto" w:after="280" w:before="0"/>
         <w:ind w:firstLine="709"/>
         <w:jc w:val="both"/>
         <w:outlineLvl w:val="0"/>
@@ -2483,225 +2483,225 @@
     </w:p>
     <w:p>
       <w:pPr>
-        <w:spacing w:line="240" w:lineRule="auto" w:after="0" w:before="0"/>
-        <w:ind w:firstLine="709"/>
-        <w:jc w:val="both"/>
-      </w:pPr>
-      <w:r>
-        <w:rPr>
-          <w:rFonts w:ascii="Times New Roman" w:hAnsi="Times New Roman" w:eastAsia="Times New Roman"/>
-          <w:b w:val="0"/>
-          <w:sz w:val="26"/>
+        <w:spacing w:line="360" w:lineRule="auto" w:after="0" w:before="0"/>
+        <w:ind w:firstLine="709"/>
+        <w:jc w:val="both"/>
+      </w:pPr>
+      <w:r>
+        <w:rPr>
+          <w:rFonts w:ascii="Times New Roman" w:hAnsi="Times New Roman" w:eastAsia="Times New Roman"/>
+          <w:b w:val="0"/>
+          <w:sz w:val="28"/>
         </w:rPr>
         <w:t>1. Psychology 2e : textbook / Spielman R. M., Jenkins W. J., Lovett M. D. Houston : OpenStax, 2020. Section 1.2. History of Psychology. URL: https://openstax.org/books/psychology-2e/pages/1-2-history-of-psychology (дата обращения: 11.10.2026).</w:t>
       </w:r>
     </w:p>
     <w:p>
       <w:pPr>
-        <w:spacing w:line="240" w:lineRule="auto" w:after="0" w:before="0"/>
-        <w:ind w:firstLine="709"/>
-        <w:jc w:val="both"/>
-      </w:pPr>
-      <w:r>
-        <w:rPr>
-          <w:rFonts w:ascii="Times New Roman" w:hAnsi="Times New Roman" w:eastAsia="Times New Roman"/>
-          <w:b w:val="0"/>
-          <w:sz w:val="26"/>
+        <w:spacing w:line="360" w:lineRule="auto" w:after="0" w:before="0"/>
+        <w:ind w:firstLine="709"/>
+        <w:jc w:val="both"/>
+      </w:pPr>
+      <w:r>
+        <w:rPr>
+          <w:rFonts w:ascii="Times New Roman" w:hAnsi="Times New Roman" w:eastAsia="Times New Roman"/>
+          <w:b w:val="0"/>
+          <w:sz w:val="28"/>
         </w:rPr>
         <w:t>2. Yoshimura H. Early psychological apparatuses stored in Japan: imported, replicated, and reformed apparatuses before World War II // Japanese Psychological Research. 2016. Vol. 58, suppl. 1. P. 32–45. DOI: 10.1111/jpr.12112.</w:t>
       </w:r>
     </w:p>
     <w:p>
       <w:pPr>
-        <w:spacing w:line="240" w:lineRule="auto" w:after="0" w:before="0"/>
-        <w:ind w:firstLine="709"/>
-        <w:jc w:val="both"/>
-      </w:pPr>
-      <w:r>
-        <w:rPr>
-          <w:rFonts w:ascii="Times New Roman" w:hAnsi="Times New Roman" w:eastAsia="Times New Roman"/>
-          <w:b w:val="0"/>
-          <w:sz w:val="26"/>
+        <w:spacing w:line="360" w:lineRule="auto" w:after="0" w:before="0"/>
+        <w:ind w:firstLine="709"/>
+        <w:jc w:val="both"/>
+      </w:pPr>
+      <w:r>
+        <w:rPr>
+          <w:rFonts w:ascii="Times New Roman" w:hAnsi="Times New Roman" w:eastAsia="Times New Roman"/>
+          <w:b w:val="0"/>
+          <w:sz w:val="28"/>
         </w:rPr>
         <w:t>3. Schoenherr J. R. Prestige technology in the evolution and social organization of early psychological science // Theory &amp; Psychology. 2017. DOI: 10.1177/0959354316677076.</w:t>
       </w:r>
     </w:p>
     <w:p>
       <w:pPr>
-        <w:spacing w:line="240" w:lineRule="auto" w:after="0" w:before="0"/>
-        <w:ind w:firstLine="709"/>
-        <w:jc w:val="both"/>
-      </w:pPr>
-      <w:r>
-        <w:rPr>
-          <w:rFonts w:ascii="Times New Roman" w:hAnsi="Times New Roman" w:eastAsia="Times New Roman"/>
-          <w:b w:val="0"/>
-          <w:sz w:val="26"/>
+        <w:spacing w:line="360" w:lineRule="auto" w:after="0" w:before="0"/>
+        <w:ind w:firstLine="709"/>
+        <w:jc w:val="both"/>
+      </w:pPr>
+      <w:r>
+        <w:rPr>
+          <w:rFonts w:ascii="Times New Roman" w:hAnsi="Times New Roman" w:eastAsia="Times New Roman"/>
+          <w:b w:val="0"/>
+          <w:sz w:val="28"/>
         </w:rPr>
         <w:t>4. Lemke J. R., Kluger G., Krämer G. Hans Berger und 100 Jahre Elektroenzephalogramm // Clinical Epileptology. 2024. Vol. 37. P. 103–111. DOI: 10.1007/s10309-024-00664-x.</w:t>
       </w:r>
     </w:p>
     <w:p>
       <w:pPr>
-        <w:spacing w:line="240" w:lineRule="auto" w:after="0" w:before="0"/>
-        <w:ind w:firstLine="709"/>
-        <w:jc w:val="both"/>
-      </w:pPr>
-      <w:r>
-        <w:rPr>
-          <w:rFonts w:ascii="Times New Roman" w:hAnsi="Times New Roman" w:eastAsia="Times New Roman"/>
-          <w:b w:val="0"/>
-          <w:sz w:val="26"/>
+        <w:spacing w:line="360" w:lineRule="auto" w:after="0" w:before="0"/>
+        <w:ind w:firstLine="709"/>
+        <w:jc w:val="both"/>
+      </w:pPr>
+      <w:r>
+        <w:rPr>
+          <w:rFonts w:ascii="Times New Roman" w:hAnsi="Times New Roman" w:eastAsia="Times New Roman"/>
+          <w:b w:val="0"/>
+          <w:sz w:val="28"/>
         </w:rPr>
         <w:t>5. Peirce J., Gray J. R., Simpson S. [et al.]. PsychoPy2: experiments in behavior made easy // Behavior Research Methods. 2019. Vol. 51. P. 195–203. DOI: 10.3758/s13428-018-01193-y.</w:t>
       </w:r>
     </w:p>
     <w:p>
       <w:pPr>
-        <w:spacing w:line="240" w:lineRule="auto" w:after="0" w:before="0"/>
-        <w:ind w:firstLine="709"/>
-        <w:jc w:val="both"/>
-      </w:pPr>
-      <w:r>
-        <w:rPr>
-          <w:rFonts w:ascii="Times New Roman" w:hAnsi="Times New Roman" w:eastAsia="Times New Roman"/>
-          <w:b w:val="0"/>
-          <w:sz w:val="26"/>
+        <w:spacing w:line="360" w:lineRule="auto" w:after="0" w:before="0"/>
+        <w:ind w:firstLine="709"/>
+        <w:jc w:val="both"/>
+      </w:pPr>
+      <w:r>
+        <w:rPr>
+          <w:rFonts w:ascii="Times New Roman" w:hAnsi="Times New Roman" w:eastAsia="Times New Roman"/>
+          <w:b w:val="0"/>
+          <w:sz w:val="28"/>
         </w:rPr>
         <w:t>6. Bridges D., Pitiot A., MacAskill M. R. [et al.]. The timing mega-study: comparing a range of experiment generators, both lab-based and online // PeerJ. 2020. Vol. 8. Art. e9414. DOI: 10.7717/peerj.9414.</w:t>
       </w:r>
     </w:p>
     <w:p>
       <w:pPr>
-        <w:spacing w:line="240" w:lineRule="auto" w:after="0" w:before="0"/>
-        <w:ind w:firstLine="709"/>
-        <w:jc w:val="both"/>
-      </w:pPr>
-      <w:r>
-        <w:rPr>
-          <w:rFonts w:ascii="Times New Roman" w:hAnsi="Times New Roman" w:eastAsia="Times New Roman"/>
-          <w:b w:val="0"/>
-          <w:sz w:val="26"/>
+        <w:spacing w:line="360" w:lineRule="auto" w:after="0" w:before="0"/>
+        <w:ind w:firstLine="709"/>
+        <w:jc w:val="both"/>
+      </w:pPr>
+      <w:r>
+        <w:rPr>
+          <w:rFonts w:ascii="Times New Roman" w:hAnsi="Times New Roman" w:eastAsia="Times New Roman"/>
+          <w:b w:val="0"/>
+          <w:sz w:val="28"/>
         </w:rPr>
         <w:t>7. Valtakari N. V., Hooge I. T. C., Viktorsson C. [et al.]. Eye tracking in human interaction: possibilities and limitations // Behavior Research Methods. 2021. Vol. 53. P. 1592–1608. DOI: 10.3758/s13428-020-01517-x.</w:t>
       </w:r>
     </w:p>
     <w:p>
       <w:pPr>
-        <w:spacing w:line="240" w:lineRule="auto" w:after="0" w:before="0"/>
-        <w:ind w:firstLine="709"/>
-        <w:jc w:val="both"/>
-      </w:pPr>
-      <w:r>
-        <w:rPr>
-          <w:rFonts w:ascii="Times New Roman" w:hAnsi="Times New Roman" w:eastAsia="Times New Roman"/>
-          <w:b w:val="0"/>
-          <w:sz w:val="26"/>
+        <w:spacing w:line="360" w:lineRule="auto" w:after="0" w:before="0"/>
+        <w:ind w:firstLine="709"/>
+        <w:jc w:val="both"/>
+      </w:pPr>
+      <w:r>
+        <w:rPr>
+          <w:rFonts w:ascii="Times New Roman" w:hAnsi="Times New Roman" w:eastAsia="Times New Roman"/>
+          <w:b w:val="0"/>
+          <w:sz w:val="28"/>
         </w:rPr>
         <w:t>8. Eklund A., Nichols T. E., Knutsson H. Cluster failure: why fMRI inferences for spatial extent have inflated false-positive rates // Proceedings of the National Academy of Sciences. 2016. Vol. 113, no. 28. P. 7900–7905. DOI: 10.1073/pnas.1602413113.</w:t>
       </w:r>
     </w:p>
     <w:p>
       <w:pPr>
-        <w:spacing w:line="240" w:lineRule="auto" w:after="0" w:before="0"/>
-        <w:ind w:firstLine="709"/>
-        <w:jc w:val="both"/>
-      </w:pPr>
-      <w:r>
-        <w:rPr>
-          <w:rFonts w:ascii="Times New Roman" w:hAnsi="Times New Roman" w:eastAsia="Times New Roman"/>
-          <w:b w:val="0"/>
-          <w:sz w:val="26"/>
+        <w:spacing w:line="360" w:lineRule="auto" w:after="0" w:before="0"/>
+        <w:ind w:firstLine="709"/>
+        <w:jc w:val="both"/>
+      </w:pPr>
+      <w:r>
+        <w:rPr>
+          <w:rFonts w:ascii="Times New Roman" w:hAnsi="Times New Roman" w:eastAsia="Times New Roman"/>
+          <w:b w:val="0"/>
+          <w:sz w:val="28"/>
         </w:rPr>
         <w:t>9. Poldrack R. A., Baker C. I., Durnez J. [et al.]. Scanning the horizon: towards transparent and reproducible neuroimaging research // Nature Reviews Neuroscience. 2017. Vol. 18. P. 115–126. DOI: 10.1038/nrn.2016.167.</w:t>
       </w:r>
     </w:p>
     <w:p>
       <w:pPr>
-        <w:spacing w:line="240" w:lineRule="auto" w:after="0" w:before="0"/>
-        <w:ind w:firstLine="709"/>
-        <w:jc w:val="both"/>
-      </w:pPr>
-      <w:r>
-        <w:rPr>
-          <w:rFonts w:ascii="Times New Roman" w:hAnsi="Times New Roman" w:eastAsia="Times New Roman"/>
-          <w:b w:val="0"/>
-          <w:sz w:val="26"/>
+        <w:spacing w:line="360" w:lineRule="auto" w:after="0" w:before="0"/>
+        <w:ind w:firstLine="709"/>
+        <w:jc w:val="both"/>
+      </w:pPr>
+      <w:r>
+        <w:rPr>
+          <w:rFonts w:ascii="Times New Roman" w:hAnsi="Times New Roman" w:eastAsia="Times New Roman"/>
+          <w:b w:val="0"/>
+          <w:sz w:val="28"/>
         </w:rPr>
         <w:t>10. Anwyl-Irvine A. L., Massonnié J., Flitton A. [et al.]. Gorilla in our midst: an online behavioral experiment builder // Behavior Research Methods. 2020. Vol. 52. P. 388–407. DOI: 10.3758/s13428-019-01237-x.</w:t>
       </w:r>
     </w:p>
     <w:p>
       <w:pPr>
-        <w:spacing w:line="240" w:lineRule="auto" w:after="0" w:before="0"/>
-        <w:ind w:firstLine="709"/>
-        <w:jc w:val="both"/>
-      </w:pPr>
-      <w:r>
-        <w:rPr>
-          <w:rFonts w:ascii="Times New Roman" w:hAnsi="Times New Roman" w:eastAsia="Times New Roman"/>
-          <w:b w:val="0"/>
-          <w:sz w:val="26"/>
+        <w:spacing w:line="360" w:lineRule="auto" w:after="0" w:before="0"/>
+        <w:ind w:firstLine="709"/>
+        <w:jc w:val="both"/>
+      </w:pPr>
+      <w:r>
+        <w:rPr>
+          <w:rFonts w:ascii="Times New Roman" w:hAnsi="Times New Roman" w:eastAsia="Times New Roman"/>
+          <w:b w:val="0"/>
+          <w:sz w:val="28"/>
         </w:rPr>
         <w:t>11. de Leeuw J. R., Gilbert R. A., Luchterhandt B. jsPsych: enabling an open-source collaborative ecosystem of behavioral experiments // Journal of Open Source Software. 2023. Vol. 8, no. 85. Art. 5351. DOI: 10.21105/joss.05351.</w:t>
       </w:r>
     </w:p>
     <w:p>
       <w:pPr>
-        <w:spacing w:line="240" w:lineRule="auto" w:after="0" w:before="0"/>
-        <w:ind w:firstLine="709"/>
-        <w:jc w:val="both"/>
-      </w:pPr>
-      <w:r>
-        <w:rPr>
-          <w:rFonts w:ascii="Times New Roman" w:hAnsi="Times New Roman" w:eastAsia="Times New Roman"/>
-          <w:b w:val="0"/>
-          <w:sz w:val="26"/>
+        <w:spacing w:line="360" w:lineRule="auto" w:after="0" w:before="0"/>
+        <w:ind w:firstLine="709"/>
+        <w:jc w:val="both"/>
+      </w:pPr>
+      <w:r>
+        <w:rPr>
+          <w:rFonts w:ascii="Times New Roman" w:hAnsi="Times New Roman" w:eastAsia="Times New Roman"/>
+          <w:b w:val="0"/>
+          <w:sz w:val="28"/>
         </w:rPr>
         <w:t>12. Harari G. M., Gosling S. D. Understanding behaviours in context using mobile sensing // Nature Reviews Psychology. 2023. Vol. 2. P. 767–779. DOI: 10.1038/s44159-023-00235-3.</w:t>
       </w:r>
     </w:p>
     <w:p>
       <w:pPr>
-        <w:spacing w:line="240" w:lineRule="auto" w:after="0" w:before="0"/>
-        <w:ind w:firstLine="709"/>
-        <w:jc w:val="both"/>
-      </w:pPr>
-      <w:r>
-        <w:rPr>
-          <w:rFonts w:ascii="Times New Roman" w:hAnsi="Times New Roman" w:eastAsia="Times New Roman"/>
-          <w:b w:val="0"/>
-          <w:sz w:val="26"/>
+        <w:spacing w:line="360" w:lineRule="auto" w:after="0" w:before="0"/>
+        <w:ind w:firstLine="709"/>
+        <w:jc w:val="both"/>
+      </w:pPr>
+      <w:r>
+        <w:rPr>
+          <w:rFonts w:ascii="Times New Roman" w:hAnsi="Times New Roman" w:eastAsia="Times New Roman"/>
+          <w:b w:val="0"/>
+          <w:sz w:val="28"/>
         </w:rPr>
         <w:t>13. Slater M., Sanchez-Vives M. V. Enhancing our lives with immersive virtual reality // Frontiers in Robotics and AI. 2016. Vol. 3. Art. 74. DOI: 10.3389/frobt.2016.00074.</w:t>
       </w:r>
     </w:p>
     <w:p>
       <w:pPr>
-        <w:spacing w:line="240" w:lineRule="auto" w:after="0" w:before="0"/>
-        <w:ind w:firstLine="709"/>
-        <w:jc w:val="both"/>
-      </w:pPr>
-      <w:r>
-        <w:rPr>
-          <w:rFonts w:ascii="Times New Roman" w:hAnsi="Times New Roman" w:eastAsia="Times New Roman"/>
-          <w:b w:val="0"/>
-          <w:sz w:val="26"/>
+        <w:spacing w:line="360" w:lineRule="auto" w:after="0" w:before="0"/>
+        <w:ind w:firstLine="709"/>
+        <w:jc w:val="both"/>
+      </w:pPr>
+      <w:r>
+        <w:rPr>
+          <w:rFonts w:ascii="Times New Roman" w:hAnsi="Times New Roman" w:eastAsia="Times New Roman"/>
+          <w:b w:val="0"/>
+          <w:sz w:val="28"/>
         </w:rPr>
         <w:t>14. Anderson N. C., Bischof W. F., Kingstone A. Eye tracking in virtual reality // Current Topics in Behavioral Neurosciences. 2023. Vol. 65. P. 73–100. DOI: 10.1007/7854_2022_409.</w:t>
       </w:r>
     </w:p>
     <w:p>
       <w:pPr>
-        <w:spacing w:line="240" w:lineRule="auto" w:after="0" w:before="0"/>
-        <w:ind w:firstLine="709"/>
-        <w:jc w:val="both"/>
-      </w:pPr>
-      <w:r>
-        <w:rPr>
-          <w:rFonts w:ascii="Times New Roman" w:hAnsi="Times New Roman" w:eastAsia="Times New Roman"/>
-          <w:b w:val="0"/>
-          <w:sz w:val="26"/>
+        <w:spacing w:line="360" w:lineRule="auto" w:after="0" w:before="0"/>
+        <w:ind w:firstLine="709"/>
+        <w:jc w:val="both"/>
+      </w:pPr>
+      <w:r>
+        <w:rPr>
+          <w:rFonts w:ascii="Times New Roman" w:hAnsi="Times New Roman" w:eastAsia="Times New Roman"/>
+          <w:b w:val="0"/>
+          <w:sz w:val="28"/>
         </w:rPr>
         <w:t>15. Nosek B. A., Ebersole C. R., DeHaven A. C. [et al.]. The preregistration revolution // Proceedings of the National Academy of Sciences. 2018. Vol. 115, no. 11. P. 2600–2606. DOI: 10.1073/pnas.1708274114.</w:t>
       </w:r>

</xml_diff>

<commit_message>
Referat: center intro/conclusion/sources headings, no dot after source numbers
Co-Authored-By: Claude Sonnet 5.5 <noreply@anthropic.com>
Claude-Session: https://claude.ai/code/session_01T3CFgpvwhRKeBEwy46XMTn
</commit_message>
<xml_diff>
--- a/Реферат_Гражданкина.docx
+++ b/Реферат_Гражданкина.docx
@@ -1501,8 +1501,8 @@
         <w:keepNext/>
         <w:pageBreakBefore/>
         <w:spacing w:line="360" w:lineRule="auto" w:after="280" w:before="0"/>
-        <w:ind w:firstLine="709"/>
-        <w:jc w:val="both"/>
+        <w:ind w:firstLine="0"/>
+        <w:jc w:val="center"/>
         <w:outlineLvl w:val="0"/>
       </w:pPr>
       <w:bookmarkStart w:id="" w:name="_Toc1"/>
@@ -2371,8 +2371,8 @@
         <w:keepNext/>
         <w:pageBreakBefore/>
         <w:spacing w:line="360" w:lineRule="auto" w:after="280" w:before="0"/>
-        <w:ind w:firstLine="709"/>
-        <w:jc w:val="both"/>
+        <w:ind w:firstLine="0"/>
+        <w:jc w:val="center"/>
         <w:outlineLvl w:val="0"/>
       </w:pPr>
       <w:bookmarkStart w:id="0" w:name="_Toc10"/>
@@ -2466,8 +2466,8 @@
         <w:keepNext/>
         <w:pageBreakBefore/>
         <w:spacing w:line="360" w:lineRule="auto" w:after="280" w:before="0"/>
-        <w:ind w:firstLine="709"/>
-        <w:jc w:val="both"/>
+        <w:ind w:firstLine="0"/>
+        <w:jc w:val="center"/>
         <w:outlineLvl w:val="0"/>
       </w:pPr>
       <w:bookmarkStart w:id="1" w:name="_Toc11"/>
@@ -2493,217 +2493,217 @@
           <w:b w:val="0"/>
           <w:sz w:val="28"/>
         </w:rPr>
-        <w:t>1. Psychology 2e : textbook / Spielman R. M., Jenkins W. J., Lovett M. D. Houston : OpenStax, 2020. Section 1.2. History of Psychology. URL: https://openstax.org/books/psychology-2e/pages/1-2-history-of-psychology (дата обращения: 11.10.2026).</w:t>
-      </w:r>
-    </w:p>
-    <w:p>
-      <w:pPr>
-        <w:spacing w:line="360" w:lineRule="auto" w:after="0" w:before="0"/>
-        <w:ind w:firstLine="709"/>
-        <w:jc w:val="both"/>
-      </w:pPr>
-      <w:r>
-        <w:rPr>
-          <w:rFonts w:ascii="Times New Roman" w:hAnsi="Times New Roman" w:eastAsia="Times New Roman"/>
-          <w:b w:val="0"/>
-          <w:sz w:val="28"/>
-        </w:rPr>
-        <w:t>2. Yoshimura H. Early psychological apparatuses stored in Japan: imported, replicated, and reformed apparatuses before World War II // Japanese Psychological Research. 2016. Vol. 58, suppl. 1. P. 32–45. DOI: 10.1111/jpr.12112.</w:t>
-      </w:r>
-    </w:p>
-    <w:p>
-      <w:pPr>
-        <w:spacing w:line="360" w:lineRule="auto" w:after="0" w:before="0"/>
-        <w:ind w:firstLine="709"/>
-        <w:jc w:val="both"/>
-      </w:pPr>
-      <w:r>
-        <w:rPr>
-          <w:rFonts w:ascii="Times New Roman" w:hAnsi="Times New Roman" w:eastAsia="Times New Roman"/>
-          <w:b w:val="0"/>
-          <w:sz w:val="28"/>
-        </w:rPr>
-        <w:t>3. Schoenherr J. R. Prestige technology in the evolution and social organization of early psychological science // Theory &amp; Psychology. 2017. DOI: 10.1177/0959354316677076.</w:t>
-      </w:r>
-    </w:p>
-    <w:p>
-      <w:pPr>
-        <w:spacing w:line="360" w:lineRule="auto" w:after="0" w:before="0"/>
-        <w:ind w:firstLine="709"/>
-        <w:jc w:val="both"/>
-      </w:pPr>
-      <w:r>
-        <w:rPr>
-          <w:rFonts w:ascii="Times New Roman" w:hAnsi="Times New Roman" w:eastAsia="Times New Roman"/>
-          <w:b w:val="0"/>
-          <w:sz w:val="28"/>
-        </w:rPr>
-        <w:t>4. Lemke J. R., Kluger G., Krämer G. Hans Berger und 100 Jahre Elektroenzephalogramm // Clinical Epileptology. 2024. Vol. 37. P. 103–111. DOI: 10.1007/s10309-024-00664-x.</w:t>
-      </w:r>
-    </w:p>
-    <w:p>
-      <w:pPr>
-        <w:spacing w:line="360" w:lineRule="auto" w:after="0" w:before="0"/>
-        <w:ind w:firstLine="709"/>
-        <w:jc w:val="both"/>
-      </w:pPr>
-      <w:r>
-        <w:rPr>
-          <w:rFonts w:ascii="Times New Roman" w:hAnsi="Times New Roman" w:eastAsia="Times New Roman"/>
-          <w:b w:val="0"/>
-          <w:sz w:val="28"/>
-        </w:rPr>
-        <w:t>5. Peirce J., Gray J. R., Simpson S. [et al.]. PsychoPy2: experiments in behavior made easy // Behavior Research Methods. 2019. Vol. 51. P. 195–203. DOI: 10.3758/s13428-018-01193-y.</w:t>
-      </w:r>
-    </w:p>
-    <w:p>
-      <w:pPr>
-        <w:spacing w:line="360" w:lineRule="auto" w:after="0" w:before="0"/>
-        <w:ind w:firstLine="709"/>
-        <w:jc w:val="both"/>
-      </w:pPr>
-      <w:r>
-        <w:rPr>
-          <w:rFonts w:ascii="Times New Roman" w:hAnsi="Times New Roman" w:eastAsia="Times New Roman"/>
-          <w:b w:val="0"/>
-          <w:sz w:val="28"/>
-        </w:rPr>
-        <w:t>6. Bridges D., Pitiot A., MacAskill M. R. [et al.]. The timing mega-study: comparing a range of experiment generators, both lab-based and online // PeerJ. 2020. Vol. 8. Art. e9414. DOI: 10.7717/peerj.9414.</w:t>
-      </w:r>
-    </w:p>
-    <w:p>
-      <w:pPr>
-        <w:spacing w:line="360" w:lineRule="auto" w:after="0" w:before="0"/>
-        <w:ind w:firstLine="709"/>
-        <w:jc w:val="both"/>
-      </w:pPr>
-      <w:r>
-        <w:rPr>
-          <w:rFonts w:ascii="Times New Roman" w:hAnsi="Times New Roman" w:eastAsia="Times New Roman"/>
-          <w:b w:val="0"/>
-          <w:sz w:val="28"/>
-        </w:rPr>
-        <w:t>7. Valtakari N. V., Hooge I. T. C., Viktorsson C. [et al.]. Eye tracking in human interaction: possibilities and limitations // Behavior Research Methods. 2021. Vol. 53. P. 1592–1608. DOI: 10.3758/s13428-020-01517-x.</w:t>
-      </w:r>
-    </w:p>
-    <w:p>
-      <w:pPr>
-        <w:spacing w:line="360" w:lineRule="auto" w:after="0" w:before="0"/>
-        <w:ind w:firstLine="709"/>
-        <w:jc w:val="both"/>
-      </w:pPr>
-      <w:r>
-        <w:rPr>
-          <w:rFonts w:ascii="Times New Roman" w:hAnsi="Times New Roman" w:eastAsia="Times New Roman"/>
-          <w:b w:val="0"/>
-          <w:sz w:val="28"/>
-        </w:rPr>
-        <w:t>8. Eklund A., Nichols T. E., Knutsson H. Cluster failure: why fMRI inferences for spatial extent have inflated false-positive rates // Proceedings of the National Academy of Sciences. 2016. Vol. 113, no. 28. P. 7900–7905. DOI: 10.1073/pnas.1602413113.</w:t>
-      </w:r>
-    </w:p>
-    <w:p>
-      <w:pPr>
-        <w:spacing w:line="360" w:lineRule="auto" w:after="0" w:before="0"/>
-        <w:ind w:firstLine="709"/>
-        <w:jc w:val="both"/>
-      </w:pPr>
-      <w:r>
-        <w:rPr>
-          <w:rFonts w:ascii="Times New Roman" w:hAnsi="Times New Roman" w:eastAsia="Times New Roman"/>
-          <w:b w:val="0"/>
-          <w:sz w:val="28"/>
-        </w:rPr>
-        <w:t>9. Poldrack R. A., Baker C. I., Durnez J. [et al.]. Scanning the horizon: towards transparent and reproducible neuroimaging research // Nature Reviews Neuroscience. 2017. Vol. 18. P. 115–126. DOI: 10.1038/nrn.2016.167.</w:t>
-      </w:r>
-    </w:p>
-    <w:p>
-      <w:pPr>
-        <w:spacing w:line="360" w:lineRule="auto" w:after="0" w:before="0"/>
-        <w:ind w:firstLine="709"/>
-        <w:jc w:val="both"/>
-      </w:pPr>
-      <w:r>
-        <w:rPr>
-          <w:rFonts w:ascii="Times New Roman" w:hAnsi="Times New Roman" w:eastAsia="Times New Roman"/>
-          <w:b w:val="0"/>
-          <w:sz w:val="28"/>
-        </w:rPr>
-        <w:t>10. Anwyl-Irvine A. L., Massonnié J., Flitton A. [et al.]. Gorilla in our midst: an online behavioral experiment builder // Behavior Research Methods. 2020. Vol. 52. P. 388–407. DOI: 10.3758/s13428-019-01237-x.</w:t>
-      </w:r>
-    </w:p>
-    <w:p>
-      <w:pPr>
-        <w:spacing w:line="360" w:lineRule="auto" w:after="0" w:before="0"/>
-        <w:ind w:firstLine="709"/>
-        <w:jc w:val="both"/>
-      </w:pPr>
-      <w:r>
-        <w:rPr>
-          <w:rFonts w:ascii="Times New Roman" w:hAnsi="Times New Roman" w:eastAsia="Times New Roman"/>
-          <w:b w:val="0"/>
-          <w:sz w:val="28"/>
-        </w:rPr>
-        <w:t>11. de Leeuw J. R., Gilbert R. A., Luchterhandt B. jsPsych: enabling an open-source collaborative ecosystem of behavioral experiments // Journal of Open Source Software. 2023. Vol. 8, no. 85. Art. 5351. DOI: 10.21105/joss.05351.</w:t>
-      </w:r>
-    </w:p>
-    <w:p>
-      <w:pPr>
-        <w:spacing w:line="360" w:lineRule="auto" w:after="0" w:before="0"/>
-        <w:ind w:firstLine="709"/>
-        <w:jc w:val="both"/>
-      </w:pPr>
-      <w:r>
-        <w:rPr>
-          <w:rFonts w:ascii="Times New Roman" w:hAnsi="Times New Roman" w:eastAsia="Times New Roman"/>
-          <w:b w:val="0"/>
-          <w:sz w:val="28"/>
-        </w:rPr>
-        <w:t>12. Harari G. M., Gosling S. D. Understanding behaviours in context using mobile sensing // Nature Reviews Psychology. 2023. Vol. 2. P. 767–779. DOI: 10.1038/s44159-023-00235-3.</w:t>
-      </w:r>
-    </w:p>
-    <w:p>
-      <w:pPr>
-        <w:spacing w:line="360" w:lineRule="auto" w:after="0" w:before="0"/>
-        <w:ind w:firstLine="709"/>
-        <w:jc w:val="both"/>
-      </w:pPr>
-      <w:r>
-        <w:rPr>
-          <w:rFonts w:ascii="Times New Roman" w:hAnsi="Times New Roman" w:eastAsia="Times New Roman"/>
-          <w:b w:val="0"/>
-          <w:sz w:val="28"/>
-        </w:rPr>
-        <w:t>13. Slater M., Sanchez-Vives M. V. Enhancing our lives with immersive virtual reality // Frontiers in Robotics and AI. 2016. Vol. 3. Art. 74. DOI: 10.3389/frobt.2016.00074.</w:t>
-      </w:r>
-    </w:p>
-    <w:p>
-      <w:pPr>
-        <w:spacing w:line="360" w:lineRule="auto" w:after="0" w:before="0"/>
-        <w:ind w:firstLine="709"/>
-        <w:jc w:val="both"/>
-      </w:pPr>
-      <w:r>
-        <w:rPr>
-          <w:rFonts w:ascii="Times New Roman" w:hAnsi="Times New Roman" w:eastAsia="Times New Roman"/>
-          <w:b w:val="0"/>
-          <w:sz w:val="28"/>
-        </w:rPr>
-        <w:t>14. Anderson N. C., Bischof W. F., Kingstone A. Eye tracking in virtual reality // Current Topics in Behavioral Neurosciences. 2023. Vol. 65. P. 73–100. DOI: 10.1007/7854_2022_409.</w:t>
-      </w:r>
-    </w:p>
-    <w:p>
-      <w:pPr>
-        <w:spacing w:line="360" w:lineRule="auto" w:after="0" w:before="0"/>
-        <w:ind w:firstLine="709"/>
-        <w:jc w:val="both"/>
-      </w:pPr>
-      <w:r>
-        <w:rPr>
-          <w:rFonts w:ascii="Times New Roman" w:hAnsi="Times New Roman" w:eastAsia="Times New Roman"/>
-          <w:b w:val="0"/>
-          <w:sz w:val="28"/>
-        </w:rPr>
-        <w:t>15. Nosek B. A., Ebersole C. R., DeHaven A. C. [et al.]. The preregistration revolution // Proceedings of the National Academy of Sciences. 2018. Vol. 115, no. 11. P. 2600–2606. DOI: 10.1073/pnas.1708274114.</w:t>
+        <w:t>1 Psychology 2e : textbook / Spielman R. M., Jenkins W. J., Lovett M. D. Houston : OpenStax, 2020. Section 1.2. History of Psychology. URL: https://openstax.org/books/psychology-2e/pages/1-2-history-of-psychology (дата обращения: 11.10.2026).</w:t>
+      </w:r>
+    </w:p>
+    <w:p>
+      <w:pPr>
+        <w:spacing w:line="360" w:lineRule="auto" w:after="0" w:before="0"/>
+        <w:ind w:firstLine="709"/>
+        <w:jc w:val="both"/>
+      </w:pPr>
+      <w:r>
+        <w:rPr>
+          <w:rFonts w:ascii="Times New Roman" w:hAnsi="Times New Roman" w:eastAsia="Times New Roman"/>
+          <w:b w:val="0"/>
+          <w:sz w:val="28"/>
+        </w:rPr>
+        <w:t>2 Yoshimura H. Early psychological apparatuses stored in Japan: imported, replicated, and reformed apparatuses before World War II // Japanese Psychological Research. 2016. Vol. 58, suppl. 1. P. 32–45. DOI: 10.1111/jpr.12112.</w:t>
+      </w:r>
+    </w:p>
+    <w:p>
+      <w:pPr>
+        <w:spacing w:line="360" w:lineRule="auto" w:after="0" w:before="0"/>
+        <w:ind w:firstLine="709"/>
+        <w:jc w:val="both"/>
+      </w:pPr>
+      <w:r>
+        <w:rPr>
+          <w:rFonts w:ascii="Times New Roman" w:hAnsi="Times New Roman" w:eastAsia="Times New Roman"/>
+          <w:b w:val="0"/>
+          <w:sz w:val="28"/>
+        </w:rPr>
+        <w:t>3 Schoenherr J. R. Prestige technology in the evolution and social organization of early psychological science // Theory &amp; Psychology. 2017. DOI: 10.1177/0959354316677076.</w:t>
+      </w:r>
+    </w:p>
+    <w:p>
+      <w:pPr>
+        <w:spacing w:line="360" w:lineRule="auto" w:after="0" w:before="0"/>
+        <w:ind w:firstLine="709"/>
+        <w:jc w:val="both"/>
+      </w:pPr>
+      <w:r>
+        <w:rPr>
+          <w:rFonts w:ascii="Times New Roman" w:hAnsi="Times New Roman" w:eastAsia="Times New Roman"/>
+          <w:b w:val="0"/>
+          <w:sz w:val="28"/>
+        </w:rPr>
+        <w:t>4 Lemke J. R., Kluger G., Krämer G. Hans Berger und 100 Jahre Elektroenzephalogramm // Clinical Epileptology. 2024. Vol. 37. P. 103–111. DOI: 10.1007/s10309-024-00664-x.</w:t>
+      </w:r>
+    </w:p>
+    <w:p>
+      <w:pPr>
+        <w:spacing w:line="360" w:lineRule="auto" w:after="0" w:before="0"/>
+        <w:ind w:firstLine="709"/>
+        <w:jc w:val="both"/>
+      </w:pPr>
+      <w:r>
+        <w:rPr>
+          <w:rFonts w:ascii="Times New Roman" w:hAnsi="Times New Roman" w:eastAsia="Times New Roman"/>
+          <w:b w:val="0"/>
+          <w:sz w:val="28"/>
+        </w:rPr>
+        <w:t>5 Peirce J., Gray J. R., Simpson S. [et al.]. PsychoPy2: experiments in behavior made easy // Behavior Research Methods. 2019. Vol. 51. P. 195–203. DOI: 10.3758/s13428-018-01193-y.</w:t>
+      </w:r>
+    </w:p>
+    <w:p>
+      <w:pPr>
+        <w:spacing w:line="360" w:lineRule="auto" w:after="0" w:before="0"/>
+        <w:ind w:firstLine="709"/>
+        <w:jc w:val="both"/>
+      </w:pPr>
+      <w:r>
+        <w:rPr>
+          <w:rFonts w:ascii="Times New Roman" w:hAnsi="Times New Roman" w:eastAsia="Times New Roman"/>
+          <w:b w:val="0"/>
+          <w:sz w:val="28"/>
+        </w:rPr>
+        <w:t>6 Bridges D., Pitiot A., MacAskill M. R. [et al.]. The timing mega-study: comparing a range of experiment generators, both lab-based and online // PeerJ. 2020. Vol. 8. Art. e9414. DOI: 10.7717/peerj.9414.</w:t>
+      </w:r>
+    </w:p>
+    <w:p>
+      <w:pPr>
+        <w:spacing w:line="360" w:lineRule="auto" w:after="0" w:before="0"/>
+        <w:ind w:firstLine="709"/>
+        <w:jc w:val="both"/>
+      </w:pPr>
+      <w:r>
+        <w:rPr>
+          <w:rFonts w:ascii="Times New Roman" w:hAnsi="Times New Roman" w:eastAsia="Times New Roman"/>
+          <w:b w:val="0"/>
+          <w:sz w:val="28"/>
+        </w:rPr>
+        <w:t>7 Valtakari N. V., Hooge I. T. C., Viktorsson C. [et al.]. Eye tracking in human interaction: possibilities and limitations // Behavior Research Methods. 2021. Vol. 53. P. 1592–1608. DOI: 10.3758/s13428-020-01517-x.</w:t>
+      </w:r>
+    </w:p>
+    <w:p>
+      <w:pPr>
+        <w:spacing w:line="360" w:lineRule="auto" w:after="0" w:before="0"/>
+        <w:ind w:firstLine="709"/>
+        <w:jc w:val="both"/>
+      </w:pPr>
+      <w:r>
+        <w:rPr>
+          <w:rFonts w:ascii="Times New Roman" w:hAnsi="Times New Roman" w:eastAsia="Times New Roman"/>
+          <w:b w:val="0"/>
+          <w:sz w:val="28"/>
+        </w:rPr>
+        <w:t>8 Eklund A., Nichols T. E., Knutsson H. Cluster failure: why fMRI inferences for spatial extent have inflated false-positive rates // Proceedings of the National Academy of Sciences. 2016. Vol. 113, no. 28. P. 7900–7905. DOI: 10.1073/pnas.1602413113.</w:t>
+      </w:r>
+    </w:p>
+    <w:p>
+      <w:pPr>
+        <w:spacing w:line="360" w:lineRule="auto" w:after="0" w:before="0"/>
+        <w:ind w:firstLine="709"/>
+        <w:jc w:val="both"/>
+      </w:pPr>
+      <w:r>
+        <w:rPr>
+          <w:rFonts w:ascii="Times New Roman" w:hAnsi="Times New Roman" w:eastAsia="Times New Roman"/>
+          <w:b w:val="0"/>
+          <w:sz w:val="28"/>
+        </w:rPr>
+        <w:t>9 Poldrack R. A., Baker C. I., Durnez J. [et al.]. Scanning the horizon: towards transparent and reproducible neuroimaging research // Nature Reviews Neuroscience. 2017. Vol. 18. P. 115–126. DOI: 10.1038/nrn.2016.167.</w:t>
+      </w:r>
+    </w:p>
+    <w:p>
+      <w:pPr>
+        <w:spacing w:line="360" w:lineRule="auto" w:after="0" w:before="0"/>
+        <w:ind w:firstLine="709"/>
+        <w:jc w:val="both"/>
+      </w:pPr>
+      <w:r>
+        <w:rPr>
+          <w:rFonts w:ascii="Times New Roman" w:hAnsi="Times New Roman" w:eastAsia="Times New Roman"/>
+          <w:b w:val="0"/>
+          <w:sz w:val="28"/>
+        </w:rPr>
+        <w:t>10 Anwyl-Irvine A. L., Massonnié J., Flitton A. [et al.]. Gorilla in our midst: an online behavioral experiment builder // Behavior Research Methods. 2020. Vol. 52. P. 388–407. DOI: 10.3758/s13428-019-01237-x.</w:t>
+      </w:r>
+    </w:p>
+    <w:p>
+      <w:pPr>
+        <w:spacing w:line="360" w:lineRule="auto" w:after="0" w:before="0"/>
+        <w:ind w:firstLine="709"/>
+        <w:jc w:val="both"/>
+      </w:pPr>
+      <w:r>
+        <w:rPr>
+          <w:rFonts w:ascii="Times New Roman" w:hAnsi="Times New Roman" w:eastAsia="Times New Roman"/>
+          <w:b w:val="0"/>
+          <w:sz w:val="28"/>
+        </w:rPr>
+        <w:t>11 de Leeuw J. R., Gilbert R. A., Luchterhandt B. jsPsych: enabling an open-source collaborative ecosystem of behavioral experiments // Journal of Open Source Software. 2023. Vol. 8, no. 85. Art. 5351. DOI: 10.21105/joss.05351.</w:t>
+      </w:r>
+    </w:p>
+    <w:p>
+      <w:pPr>
+        <w:spacing w:line="360" w:lineRule="auto" w:after="0" w:before="0"/>
+        <w:ind w:firstLine="709"/>
+        <w:jc w:val="both"/>
+      </w:pPr>
+      <w:r>
+        <w:rPr>
+          <w:rFonts w:ascii="Times New Roman" w:hAnsi="Times New Roman" w:eastAsia="Times New Roman"/>
+          <w:b w:val="0"/>
+          <w:sz w:val="28"/>
+        </w:rPr>
+        <w:t>12 Harari G. M., Gosling S. D. Understanding behaviours in context using mobile sensing // Nature Reviews Psychology. 2023. Vol. 2. P. 767–779. DOI: 10.1038/s44159-023-00235-3.</w:t>
+      </w:r>
+    </w:p>
+    <w:p>
+      <w:pPr>
+        <w:spacing w:line="360" w:lineRule="auto" w:after="0" w:before="0"/>
+        <w:ind w:firstLine="709"/>
+        <w:jc w:val="both"/>
+      </w:pPr>
+      <w:r>
+        <w:rPr>
+          <w:rFonts w:ascii="Times New Roman" w:hAnsi="Times New Roman" w:eastAsia="Times New Roman"/>
+          <w:b w:val="0"/>
+          <w:sz w:val="28"/>
+        </w:rPr>
+        <w:t>13 Slater M., Sanchez-Vives M. V. Enhancing our lives with immersive virtual reality // Frontiers in Robotics and AI. 2016. Vol. 3. Art. 74. DOI: 10.3389/frobt.2016.00074.</w:t>
+      </w:r>
+    </w:p>
+    <w:p>
+      <w:pPr>
+        <w:spacing w:line="360" w:lineRule="auto" w:after="0" w:before="0"/>
+        <w:ind w:firstLine="709"/>
+        <w:jc w:val="both"/>
+      </w:pPr>
+      <w:r>
+        <w:rPr>
+          <w:rFonts w:ascii="Times New Roman" w:hAnsi="Times New Roman" w:eastAsia="Times New Roman"/>
+          <w:b w:val="0"/>
+          <w:sz w:val="28"/>
+        </w:rPr>
+        <w:t>14 Anderson N. C., Bischof W. F., Kingstone A. Eye tracking in virtual reality // Current Topics in Behavioral Neurosciences. 2023. Vol. 65. P. 73–100. DOI: 10.1007/7854_2022_409.</w:t>
+      </w:r>
+    </w:p>
+    <w:p>
+      <w:pPr>
+        <w:spacing w:line="360" w:lineRule="auto" w:after="0" w:before="0"/>
+        <w:ind w:firstLine="709"/>
+        <w:jc w:val="both"/>
+      </w:pPr>
+      <w:r>
+        <w:rPr>
+          <w:rFonts w:ascii="Times New Roman" w:hAnsi="Times New Roman" w:eastAsia="Times New Roman"/>
+          <w:b w:val="0"/>
+          <w:sz w:val="28"/>
+        </w:rPr>
+        <w:t>15 Nosek B. A., Ebersole C. R., DeHaven A. C. [et al.]. The preregistration revolution // Proceedings of the National Academy of Sciences. 2018. Vol. 115, no. 11. P. 2600–2606. DOI: 10.1073/pnas.1708274114.</w:t>
       </w:r>
     </w:p>
     <w:sectPr>

</xml_diff>